<commit_message>
Replace text prototypes with GUI screen mock-ups in probation CR v0.2
Seven APEX-style screens rendered to PNG (sources in prototypes/src) and
embedded in the merged CR Markdown and Word files.

Co-Authored-By: Claude Opus 5.5 <noreply@anthropic.com>
Claude-Session: https://claude.ai/code/session_01SLkyCeSeV96w3aeCje3oHa
</commit_message>
<xml_diff>
--- a/docs/CR-2026-XXX-PEV/CR-2026-XXX-PEV_CR_v0.2.docx
+++ b/docs/CR-2026-XXX-PEV/CR-2026-XXX-PEV_CR_v0.2.docx
@@ -340,7 +340,7 @@
           </w:tcPr>
           <w:p>
             <w:r>
-              <w:t>Merged CR template and SRS v0.3 into one document</w:t>
+              <w:t>Merged CR template and SRS v0.3; GUI prototypes</w:t>
             </w:r>
           </w:p>
         </w:tc>
@@ -3852,7 +3852,17 @@
     <w:p>
       <w:pPr/>
       <w:r>
-        <w:t>Each requirement below follows the client template: a summary, a prototype and the detailed functional requirements (FR-NNN) with acceptance criteria.</w:t>
+        <w:t xml:space="preserve">Each requirement below follows the client template: a summary, a GUI prototype (Oracle APEX-style screen mock-up; sample data is synthetic and form content is indicative until HR supplies the evaluation form) and the detailed functional requirements (FR-NNN) with acceptance criteria. Editable prototype sources: </w:t>
+      </w:r>
+      <w:r>
+        <w:rPr>
+          <w:rFonts w:ascii="Consolas" w:hAnsi="Consolas"/>
+          <w:sz w:val="18"/>
+        </w:rPr>
+        <w:t>prototypes/src/</w:t>
+      </w:r>
+      <w:r>
+        <w:t>.</w:t>
       </w:r>
     </w:p>
     <w:p>
@@ -3999,139 +4009,53 @@
         <w:pStyle w:val="Heading3"/>
       </w:pPr>
       <w:r>
-        <w:t>3.1.1 Prototype: Supervisor pending tasks (queue)</w:t>
+        <w:t>3.1.1 Prototype (GUI): Supervisor pending tasks (queue)</w:t>
       </w:r>
     </w:p>
     <w:p>
-      <w:pPr>
-        <w:pStyle w:val="NoSpacing"/>
-      </w:pPr>
+      <w:pPr/>
       <w:r>
         <w:rPr>
-          <w:rFonts w:ascii="Consolas" w:hAnsi="Consolas"/>
-          <w:sz w:val="17"/>
+          <w:b/>
         </w:rPr>
-        <w:t>+--------------------------------------------------------------------------------+</w:t>
+        <w:t>Screen 1 – My Pending Tasks (supervisor queue)</w:t>
       </w:r>
     </w:p>
     <w:p>
-      <w:pPr>
-        <w:pStyle w:val="NoSpacing"/>
-      </w:pPr>
-      <w:r>
-        <w:rPr>
-          <w:rFonts w:ascii="Consolas" w:hAnsi="Consolas"/>
-          <w:sz w:val="17"/>
-        </w:rPr>
-        <w:t>| My Pending Tasks                                          [Search........] (Go)|</w:t>
-      </w:r>
-    </w:p>
-    <w:p>
-      <w:pPr>
-        <w:pStyle w:val="NoSpacing"/>
-      </w:pPr>
-      <w:r>
-        <w:rPr>
-          <w:rFonts w:ascii="Consolas" w:hAnsi="Consolas"/>
-          <w:sz w:val="17"/>
-        </w:rPr>
-        <w:t>+--------------------------------------------------------------------------------+</w:t>
-      </w:r>
-    </w:p>
-    <w:p>
-      <w:pPr>
-        <w:pStyle w:val="NoSpacing"/>
-      </w:pPr>
-      <w:r>
-        <w:rPr>
-          <w:rFonts w:ascii="Consolas" w:hAnsi="Consolas"/>
-          <w:sz w:val="17"/>
-        </w:rPr>
-        <w:t>| Task                         | Employee            | Dept     | Prob. End  | Due  |</w:t>
-      </w:r>
-    </w:p>
-    <w:p>
-      <w:pPr>
-        <w:pStyle w:val="NoSpacing"/>
-      </w:pPr>
-      <w:r>
-        <w:rPr>
-          <w:rFonts w:ascii="Consolas" w:hAnsi="Consolas"/>
-          <w:sz w:val="17"/>
-        </w:rPr>
-        <w:t>|------------------------------|---------------------|----------|------------|------|</w:t>
-      </w:r>
-    </w:p>
-    <w:p>
-      <w:pPr>
-        <w:pStyle w:val="NoSpacing"/>
-      </w:pPr>
-      <w:r>
-        <w:rPr>
-          <w:rFonts w:ascii="Consolas" w:hAnsi="Consolas"/>
-          <w:sz w:val="17"/>
-        </w:rPr>
-        <w:t>| Probation Evaluation         | EMP-TEST-0001  Ali  | Nursing  | 25-Oct-2026| 15 d |</w:t>
-      </w:r>
-    </w:p>
-    <w:p>
-      <w:pPr>
-        <w:pStyle w:val="NoSpacing"/>
-      </w:pPr>
-      <w:r>
-        <w:rPr>
-          <w:rFonts w:ascii="Consolas" w:hAnsi="Consolas"/>
-          <w:sz w:val="17"/>
-        </w:rPr>
-        <w:t>| Probation Evaluation (Draft) | EMP-TEST-0002  Sara | Pharmacy | 18-Oct-2026|  8 d |</w:t>
-      </w:r>
-    </w:p>
-    <w:p>
-      <w:pPr>
-        <w:pStyle w:val="NoSpacing"/>
-      </w:pPr>
-      <w:r>
-        <w:rPr>
-          <w:rFonts w:ascii="Consolas" w:hAnsi="Consolas"/>
-          <w:sz w:val="17"/>
-        </w:rPr>
-        <w:t>| Probation Eval. (RETURNED)   | EMP-TEST-0003  Omar | Radiology| 14-Oct-2026|  4 d |</w:t>
-      </w:r>
-    </w:p>
-    <w:p>
-      <w:pPr>
-        <w:pStyle w:val="NoSpacing"/>
-      </w:pPr>
-      <w:r>
-        <w:rPr>
-          <w:rFonts w:ascii="Consolas" w:hAnsi="Consolas"/>
-          <w:sz w:val="17"/>
-        </w:rPr>
-        <w:t>+--------------------------------------------------------------------------------+</w:t>
-      </w:r>
-    </w:p>
-    <w:p>
-      <w:pPr>
-        <w:pStyle w:val="NoSpacing"/>
-      </w:pPr>
-      <w:r>
-        <w:rPr>
-          <w:rFonts w:ascii="Consolas" w:hAnsi="Consolas"/>
-          <w:sz w:val="17"/>
-        </w:rPr>
-        <w:t>| Row click -&gt; opens Probation Evaluation form                                   |</w:t>
-      </w:r>
-    </w:p>
-    <w:p>
-      <w:pPr>
-        <w:pStyle w:val="NoSpacing"/>
-      </w:pPr>
-      <w:r>
-        <w:rPr>
-          <w:rFonts w:ascii="Consolas" w:hAnsi="Consolas"/>
-          <w:sz w:val="17"/>
-        </w:rPr>
-        <w:t>+--------------------------------------------------------------------------------+</w:t>
+      <w:pPr/>
+      <w:r>
+        <w:drawing>
+          <wp:inline xmlns:a="http://schemas.openxmlformats.org/drawingml/2006/main" xmlns:pic="http://schemas.openxmlformats.org/drawingml/2006/picture">
+            <wp:extent cx="5486400" cy="2193989"/>
+            <wp:docPr id="2" name="Picture 2"/>
+            <wp:cNvGraphicFramePr>
+              <a:graphicFrameLocks noChangeAspect="1"/>
+            </wp:cNvGraphicFramePr>
+            <a:graphic>
+              <a:graphicData uri="http://schemas.openxmlformats.org/drawingml/2006/picture">
+                <pic:pic>
+                  <pic:nvPicPr>
+                    <pic:cNvPr id="0" name="01_pending_tasks.png"/>
+                    <pic:cNvPicPr/>
+                  </pic:nvPicPr>
+                  <pic:blipFill>
+                    <a:blip r:embed="rId14"/>
+                    <a:stretch>
+                      <a:fillRect/>
+                    </a:stretch>
+                  </pic:blipFill>
+                  <pic:spPr>
+                    <a:xfrm>
+                      <a:off x="0" y="0"/>
+                      <a:ext cx="5486400" cy="2193989"/>
+                    </a:xfrm>
+                    <a:prstGeom prst="rect"/>
+                  </pic:spPr>
+                </pic:pic>
+              </a:graphicData>
+            </a:graphic>
+          </wp:inline>
+        </w:drawing>
       </w:r>
     </w:p>
     <w:p>
@@ -4797,283 +4721,53 @@
         <w:pStyle w:val="Heading3"/>
       </w:pPr>
       <w:r>
-        <w:t>3.2.1 Prototype: Probation Evaluation form</w:t>
+        <w:t>3.2.1 Prototype (GUI): Probation Evaluation form</w:t>
       </w:r>
     </w:p>
     <w:p>
-      <w:pPr>
-        <w:pStyle w:val="NoSpacing"/>
-      </w:pPr>
+      <w:pPr/>
       <w:r>
         <w:rPr>
-          <w:rFonts w:ascii="Consolas" w:hAnsi="Consolas"/>
-          <w:sz w:val="17"/>
+          <w:b/>
         </w:rPr>
-        <w:t>+--------------------------------------------------------------------------------+</w:t>
+        <w:t>Screen 2 – Probation Evaluation form (Save as Draft / Submit)</w:t>
       </w:r>
     </w:p>
     <w:p>
-      <w:pPr>
-        <w:pStyle w:val="NoSpacing"/>
-      </w:pPr>
-      <w:r>
-        <w:rPr>
-          <w:rFonts w:ascii="Consolas" w:hAnsi="Consolas"/>
-          <w:sz w:val="17"/>
-        </w:rPr>
-        <w:t>| Probation Evaluation                         Status: DRAFT    Eval No: PEV-000123|</w:t>
-      </w:r>
-    </w:p>
-    <w:p>
-      <w:pPr>
-        <w:pStyle w:val="NoSpacing"/>
-      </w:pPr>
-      <w:r>
-        <w:rPr>
-          <w:rFonts w:ascii="Consolas" w:hAnsi="Consolas"/>
-          <w:sz w:val="17"/>
-        </w:rPr>
-        <w:t>+--------------------------------------------------------------------------------+</w:t>
-      </w:r>
-    </w:p>
-    <w:p>
-      <w:pPr>
-        <w:pStyle w:val="NoSpacing"/>
-      </w:pPr>
-      <w:r>
-        <w:rPr>
-          <w:rFonts w:ascii="Consolas" w:hAnsi="Consolas"/>
-          <w:sz w:val="17"/>
-        </w:rPr>
-        <w:t>| Employee : EMP-TEST-0001  Ali Raza        Designation: Staff Nurse             |</w:t>
-      </w:r>
-    </w:p>
-    <w:p>
-      <w:pPr>
-        <w:pStyle w:val="NoSpacing"/>
-      </w:pPr>
-      <w:r>
-        <w:rPr>
-          <w:rFonts w:ascii="Consolas" w:hAnsi="Consolas"/>
-          <w:sz w:val="17"/>
-        </w:rPr>
-        <w:t>| Dept     : Nursing                        Joining    : 26-Apr-2026             |</w:t>
-      </w:r>
-    </w:p>
-    <w:p>
-      <w:pPr>
-        <w:pStyle w:val="NoSpacing"/>
-      </w:pPr>
-      <w:r>
-        <w:rPr>
-          <w:rFonts w:ascii="Consolas" w:hAnsi="Consolas"/>
-          <w:sz w:val="17"/>
-        </w:rPr>
-        <w:t>| Probation: 26-Apr-2026 to 25-Oct-2026     Evaluator  : EMP-TEST-0100           |</w:t>
-      </w:r>
-    </w:p>
-    <w:p>
-      <w:pPr>
-        <w:pStyle w:val="NoSpacing"/>
-      </w:pPr>
-      <w:r>
-        <w:rPr>
-          <w:rFonts w:ascii="Consolas" w:hAnsi="Consolas"/>
-          <w:sz w:val="17"/>
-        </w:rPr>
-        <w:t>+--------------------------------------------------------------------------------+</w:t>
-      </w:r>
-    </w:p>
-    <w:p>
-      <w:pPr>
-        <w:pStyle w:val="NoSpacing"/>
-      </w:pPr>
-      <w:r>
-        <w:rPr>
-          <w:rFonts w:ascii="Consolas" w:hAnsi="Consolas"/>
-          <w:sz w:val="17"/>
-        </w:rPr>
-        <w:t>| Evaluation Criteria (from HR template)        Rating (1-5)    Remarks          |</w:t>
-      </w:r>
-    </w:p>
-    <w:p>
-      <w:pPr>
-        <w:pStyle w:val="NoSpacing"/>
-      </w:pPr>
-      <w:r>
-        <w:rPr>
-          <w:rFonts w:ascii="Consolas" w:hAnsi="Consolas"/>
-          <w:sz w:val="17"/>
-        </w:rPr>
-        <w:t>|  1. Job knowledge                    *        [ 4 v ]         [............]   |</w:t>
-      </w:r>
-    </w:p>
-    <w:p>
-      <w:pPr>
-        <w:pStyle w:val="NoSpacing"/>
-      </w:pPr>
-      <w:r>
-        <w:rPr>
-          <w:rFonts w:ascii="Consolas" w:hAnsi="Consolas"/>
-          <w:sz w:val="17"/>
-        </w:rPr>
-        <w:t>|  2. Quality of work                  *        [ 3 v ]         [............]   |</w:t>
-      </w:r>
-    </w:p>
-    <w:p>
-      <w:pPr>
-        <w:pStyle w:val="NoSpacing"/>
-      </w:pPr>
-      <w:r>
-        <w:rPr>
-          <w:rFonts w:ascii="Consolas" w:hAnsi="Consolas"/>
-          <w:sz w:val="17"/>
-        </w:rPr>
-        <w:t>|  3. Punctuality &amp; attendance         *        [ 5 v ]         [............]   |</w:t>
-      </w:r>
-    </w:p>
-    <w:p>
-      <w:pPr>
-        <w:pStyle w:val="NoSpacing"/>
-      </w:pPr>
-      <w:r>
-        <w:rPr>
-          <w:rFonts w:ascii="Consolas" w:hAnsi="Consolas"/>
-          <w:sz w:val="17"/>
-        </w:rPr>
-        <w:t>|  4. Teamwork &amp; communication         *        [ 4 v ]         [............]   |</w:t>
-      </w:r>
-    </w:p>
-    <w:p>
-      <w:pPr>
-        <w:pStyle w:val="NoSpacing"/>
-      </w:pPr>
-      <w:r>
-        <w:rPr>
-          <w:rFonts w:ascii="Consolas" w:hAnsi="Consolas"/>
-          <w:sz w:val="17"/>
-        </w:rPr>
-        <w:t>+--------------------------------------------------------------------------------+</w:t>
-      </w:r>
-    </w:p>
-    <w:p>
-      <w:pPr>
-        <w:pStyle w:val="NoSpacing"/>
-      </w:pPr>
-      <w:r>
-        <w:rPr>
-          <w:rFonts w:ascii="Consolas" w:hAnsi="Consolas"/>
-          <w:sz w:val="17"/>
-        </w:rPr>
-        <w:t>| Recommendation *  ( ) Confirm   ( ) Extend probation   ( ) Not to confirm      |</w:t>
-      </w:r>
-    </w:p>
-    <w:p>
-      <w:pPr>
-        <w:pStyle w:val="NoSpacing"/>
-      </w:pPr>
-      <w:r>
-        <w:rPr>
-          <w:rFonts w:ascii="Consolas" w:hAnsi="Consolas"/>
-          <w:sz w:val="17"/>
-        </w:rPr>
-        <w:t>| Extend by (days)  [ .... ]   (enabled only for Extend)                         |</w:t>
-      </w:r>
-    </w:p>
-    <w:p>
-      <w:pPr>
-        <w:pStyle w:val="NoSpacing"/>
-      </w:pPr>
-      <w:r>
-        <w:rPr>
-          <w:rFonts w:ascii="Consolas" w:hAnsi="Consolas"/>
-          <w:sz w:val="17"/>
-        </w:rPr>
-        <w:t>| Evaluator comments [................................................]          |</w:t>
-      </w:r>
-    </w:p>
-    <w:p>
-      <w:pPr>
-        <w:pStyle w:val="NoSpacing"/>
-      </w:pPr>
-      <w:r>
-        <w:rPr>
-          <w:rFonts w:ascii="Consolas" w:hAnsi="Consolas"/>
-          <w:sz w:val="17"/>
-        </w:rPr>
-        <w:t>| Attachments        [Choose file]                                               |</w:t>
-      </w:r>
-    </w:p>
-    <w:p>
-      <w:pPr>
-        <w:pStyle w:val="NoSpacing"/>
-      </w:pPr>
-      <w:r>
-        <w:rPr>
-          <w:rFonts w:ascii="Consolas" w:hAnsi="Consolas"/>
-          <w:sz w:val="17"/>
-        </w:rPr>
-        <w:t>+--------------------------------------------------------------------------------+</w:t>
-      </w:r>
-    </w:p>
-    <w:p>
-      <w:pPr>
-        <w:pStyle w:val="NoSpacing"/>
-      </w:pPr>
-      <w:r>
-        <w:rPr>
-          <w:rFonts w:ascii="Consolas" w:hAnsi="Consolas"/>
-          <w:sz w:val="17"/>
-        </w:rPr>
-        <w:t>| Approval history / comments (read-only)                                        |</w:t>
-      </w:r>
-    </w:p>
-    <w:p>
-      <w:pPr>
-        <w:pStyle w:val="NoSpacing"/>
-      </w:pPr>
-      <w:r>
-        <w:rPr>
-          <w:rFonts w:ascii="Consolas" w:hAnsi="Consolas"/>
-          <w:sz w:val="17"/>
-        </w:rPr>
-        <w:t>+--------------------------------------------------------------------------------+</w:t>
-      </w:r>
-    </w:p>
-    <w:p>
-      <w:pPr>
-        <w:pStyle w:val="NoSpacing"/>
-      </w:pPr>
-      <w:r>
-        <w:rPr>
-          <w:rFonts w:ascii="Consolas" w:hAnsi="Consolas"/>
-          <w:sz w:val="17"/>
-        </w:rPr>
-        <w:t>|                                  [ Save as Draft ]  [ Submit ]  [ Cancel ]     |</w:t>
-      </w:r>
-    </w:p>
-    <w:p>
-      <w:pPr>
-        <w:pStyle w:val="NoSpacing"/>
-      </w:pPr>
-      <w:r>
-        <w:rPr>
-          <w:rFonts w:ascii="Consolas" w:hAnsi="Consolas"/>
-          <w:sz w:val="17"/>
-        </w:rPr>
-        <w:t>+--------------------------------------------------------------------------------+</w:t>
-      </w:r>
-    </w:p>
-    <w:p>
-      <w:pPr>
-        <w:pStyle w:val="NoSpacing"/>
-      </w:pPr>
-      <w:r>
-        <w:rPr>
-          <w:rFonts w:ascii="Consolas" w:hAnsi="Consolas"/>
-          <w:sz w:val="17"/>
-        </w:rPr>
-        <w:t xml:space="preserve">  * = mandatory on Submit only</w:t>
+      <w:pPr/>
+      <w:r>
+        <w:drawing>
+          <wp:inline xmlns:a="http://schemas.openxmlformats.org/drawingml/2006/main" xmlns:pic="http://schemas.openxmlformats.org/drawingml/2006/picture">
+            <wp:extent cx="5486400" cy="4522072"/>
+            <wp:docPr id="3" name="Picture 3"/>
+            <wp:cNvGraphicFramePr>
+              <a:graphicFrameLocks noChangeAspect="1"/>
+            </wp:cNvGraphicFramePr>
+            <a:graphic>
+              <a:graphicData uri="http://schemas.openxmlformats.org/drawingml/2006/picture">
+                <pic:pic>
+                  <pic:nvPicPr>
+                    <pic:cNvPr id="0" name="02_evaluation_form.png"/>
+                    <pic:cNvPicPr/>
+                  </pic:nvPicPr>
+                  <pic:blipFill>
+                    <a:blip r:embed="rId15"/>
+                    <a:stretch>
+                      <a:fillRect/>
+                    </a:stretch>
+                  </pic:blipFill>
+                  <pic:spPr>
+                    <a:xfrm>
+                      <a:off x="0" y="0"/>
+                      <a:ext cx="5486400" cy="4522072"/>
+                    </a:xfrm>
+                    <a:prstGeom prst="rect"/>
+                  </pic:spPr>
+                </pic:pic>
+              </a:graphicData>
+            </a:graphic>
+          </wp:inline>
+        </w:drawing>
       </w:r>
     </w:p>
     <w:p>
@@ -5609,234 +5303,99 @@
         <w:pStyle w:val="Heading3"/>
       </w:pPr>
       <w:r>
-        <w:t>3.3.1 Prototype: Approver screen and hierarchy setup</w:t>
+        <w:t>3.3.1 Prototype (GUI): Approver screen and hierarchy setup</w:t>
       </w:r>
     </w:p>
     <w:p>
-      <w:pPr>
-        <w:pStyle w:val="NoSpacing"/>
-      </w:pPr>
+      <w:pPr/>
       <w:r>
         <w:rPr>
-          <w:rFonts w:ascii="Consolas" w:hAnsi="Consolas"/>
-          <w:sz w:val="17"/>
+          <w:b/>
         </w:rPr>
-        <w:t>+--------------------------------------------------------------------------------+</w:t>
+        <w:t>Screen 3 – Approver view (Approve / Return)</w:t>
       </w:r>
     </w:p>
     <w:p>
-      <w:pPr>
-        <w:pStyle w:val="NoSpacing"/>
-      </w:pPr>
-      <w:r>
-        <w:rPr>
-          <w:rFonts w:ascii="Consolas" w:hAnsi="Consolas"/>
-          <w:sz w:val="17"/>
-        </w:rPr>
-        <w:t>| Probation Evaluation - Approval       Status: PENDING APPROVAL - LEVEL 1 (HOD) |</w:t>
+      <w:pPr/>
+      <w:r>
+        <w:drawing>
+          <wp:inline xmlns:a="http://schemas.openxmlformats.org/drawingml/2006/main" xmlns:pic="http://schemas.openxmlformats.org/drawingml/2006/picture">
+            <wp:extent cx="5486400" cy="5295246"/>
+            <wp:docPr id="4" name="Picture 4"/>
+            <wp:cNvGraphicFramePr>
+              <a:graphicFrameLocks noChangeAspect="1"/>
+            </wp:cNvGraphicFramePr>
+            <a:graphic>
+              <a:graphicData uri="http://schemas.openxmlformats.org/drawingml/2006/picture">
+                <pic:pic>
+                  <pic:nvPicPr>
+                    <pic:cNvPr id="0" name="03_approver.png"/>
+                    <pic:cNvPicPr/>
+                  </pic:nvPicPr>
+                  <pic:blipFill>
+                    <a:blip r:embed="rId16"/>
+                    <a:stretch>
+                      <a:fillRect/>
+                    </a:stretch>
+                  </pic:blipFill>
+                  <pic:spPr>
+                    <a:xfrm>
+                      <a:off x="0" y="0"/>
+                      <a:ext cx="5486400" cy="5295246"/>
+                    </a:xfrm>
+                    <a:prstGeom prst="rect"/>
+                  </pic:spPr>
+                </pic:pic>
+              </a:graphicData>
+            </a:graphic>
+          </wp:inline>
+        </w:drawing>
       </w:r>
     </w:p>
     <w:p>
-      <w:pPr>
-        <w:pStyle w:val="NoSpacing"/>
-      </w:pPr>
+      <w:pPr/>
       <w:r>
         <w:rPr>
-          <w:rFonts w:ascii="Consolas" w:hAnsi="Consolas"/>
-          <w:sz w:val="17"/>
+          <w:b/>
         </w:rPr>
-        <w:t>+--------------------------------------------------------------------------------+</w:t>
+        <w:t>Screen 4 – Probation Approval Hierarchy Setup (HR Administrator)</w:t>
       </w:r>
     </w:p>
     <w:p>
-      <w:pPr>
-        <w:pStyle w:val="NoSpacing"/>
-      </w:pPr>
-      <w:r>
-        <w:rPr>
-          <w:rFonts w:ascii="Consolas" w:hAnsi="Consolas"/>
-          <w:sz w:val="17"/>
-        </w:rPr>
-        <w:t>| [ Evaluation form shown read-only, as in Requirement 2 ]                       |</w:t>
-      </w:r>
-    </w:p>
-    <w:p>
-      <w:pPr>
-        <w:pStyle w:val="NoSpacing"/>
-      </w:pPr>
-      <w:r>
-        <w:rPr>
-          <w:rFonts w:ascii="Consolas" w:hAnsi="Consolas"/>
-          <w:sz w:val="17"/>
-        </w:rPr>
-        <w:t>+--------------------------------------------------------------------------------+</w:t>
-      </w:r>
-    </w:p>
-    <w:p>
-      <w:pPr>
-        <w:pStyle w:val="NoSpacing"/>
-      </w:pPr>
-      <w:r>
-        <w:rPr>
-          <w:rFonts w:ascii="Consolas" w:hAnsi="Consolas"/>
-          <w:sz w:val="17"/>
-        </w:rPr>
-        <w:t>| Routing:  L1 HOD Nursing (you) -&gt; L2 Director Nursing -&gt; HR                    |</w:t>
-      </w:r>
-    </w:p>
-    <w:p>
-      <w:pPr>
-        <w:pStyle w:val="NoSpacing"/>
-      </w:pPr>
-      <w:r>
-        <w:rPr>
-          <w:rFonts w:ascii="Consolas" w:hAnsi="Consolas"/>
-          <w:sz w:val="17"/>
-        </w:rPr>
-        <w:t>| Approver comments [..........................................................] |</w:t>
-      </w:r>
-    </w:p>
-    <w:p>
-      <w:pPr>
-        <w:pStyle w:val="NoSpacing"/>
-      </w:pPr>
-      <w:r>
-        <w:rPr>
-          <w:rFonts w:ascii="Consolas" w:hAnsi="Consolas"/>
-          <w:sz w:val="17"/>
-        </w:rPr>
-        <w:t>|                                    [ Approve ]   [ Return to Evaluator ]       |</w:t>
-      </w:r>
-    </w:p>
-    <w:p>
-      <w:pPr>
-        <w:pStyle w:val="NoSpacing"/>
-      </w:pPr>
-      <w:r>
-        <w:rPr>
-          <w:rFonts w:ascii="Consolas" w:hAnsi="Consolas"/>
-          <w:sz w:val="17"/>
-        </w:rPr>
-        <w:t>+--------------------------------------------------------------------------------+</w:t>
-      </w:r>
-    </w:p>
-    <w:p>
-      <w:pPr>
-        <w:pStyle w:val="NoSpacing"/>
-      </w:pPr>
-      <w:r>
-        <w:rPr>
-          <w:rFonts w:ascii="Consolas" w:hAnsi="Consolas"/>
-          <w:sz w:val="17"/>
-        </w:rPr>
-      </w:r>
-    </w:p>
-    <w:p>
-      <w:pPr>
-        <w:pStyle w:val="NoSpacing"/>
-      </w:pPr>
-      <w:r>
-        <w:rPr>
-          <w:rFonts w:ascii="Consolas" w:hAnsi="Consolas"/>
-          <w:sz w:val="17"/>
-        </w:rPr>
-        <w:t>+--------------------------------------------------------------------------------+</w:t>
-      </w:r>
-    </w:p>
-    <w:p>
-      <w:pPr>
-        <w:pStyle w:val="NoSpacing"/>
-      </w:pPr>
-      <w:r>
-        <w:rPr>
-          <w:rFonts w:ascii="Consolas" w:hAnsi="Consolas"/>
-          <w:sz w:val="17"/>
-        </w:rPr>
-        <w:t>| Probation Approval Hierarchy Setup  (HR Administrator)                         |</w:t>
-      </w:r>
-    </w:p>
-    <w:p>
-      <w:pPr>
-        <w:pStyle w:val="NoSpacing"/>
-      </w:pPr>
-      <w:r>
-        <w:rPr>
-          <w:rFonts w:ascii="Consolas" w:hAnsi="Consolas"/>
-          <w:sz w:val="17"/>
-        </w:rPr>
-        <w:t>+--------------------------------------------------------------------------------+</w:t>
-      </w:r>
-    </w:p>
-    <w:p>
-      <w:pPr>
-        <w:pStyle w:val="NoSpacing"/>
-      </w:pPr>
-      <w:r>
-        <w:rPr>
-          <w:rFonts w:ascii="Consolas" w:hAnsi="Consolas"/>
-          <w:sz w:val="17"/>
-        </w:rPr>
-        <w:t>| Department / Grade | Level | Approver role        | Active |                   |</w:t>
-      </w:r>
-    </w:p>
-    <w:p>
-      <w:pPr>
-        <w:pStyle w:val="NoSpacing"/>
-      </w:pPr>
-      <w:r>
-        <w:rPr>
-          <w:rFonts w:ascii="Consolas" w:hAnsi="Consolas"/>
-          <w:sz w:val="17"/>
-        </w:rPr>
-        <w:t>|--------------------|-------|----------------------|--------|                   |</w:t>
-      </w:r>
-    </w:p>
-    <w:p>
-      <w:pPr>
-        <w:pStyle w:val="NoSpacing"/>
-      </w:pPr>
-      <w:r>
-        <w:rPr>
-          <w:rFonts w:ascii="Consolas" w:hAnsi="Consolas"/>
-          <w:sz w:val="17"/>
-        </w:rPr>
-        <w:t>| Nursing            |   1   | Head of Department   |   Y    |                   |</w:t>
-      </w:r>
-    </w:p>
-    <w:p>
-      <w:pPr>
-        <w:pStyle w:val="NoSpacing"/>
-      </w:pPr>
-      <w:r>
-        <w:rPr>
-          <w:rFonts w:ascii="Consolas" w:hAnsi="Consolas"/>
-          <w:sz w:val="17"/>
-        </w:rPr>
-        <w:t>| Nursing            |   2   | Director Nursing     |   Y    |                   |</w:t>
-      </w:r>
-    </w:p>
-    <w:p>
-      <w:pPr>
-        <w:pStyle w:val="NoSpacing"/>
-      </w:pPr>
-      <w:r>
-        <w:rPr>
-          <w:rFonts w:ascii="Consolas" w:hAnsi="Consolas"/>
-          <w:sz w:val="17"/>
-        </w:rPr>
-        <w:t>| (All)              |   1   | Head of Department   |   Y    |   [Add] [Save]    |</w:t>
-      </w:r>
-    </w:p>
-    <w:p>
-      <w:pPr>
-        <w:pStyle w:val="NoSpacing"/>
-      </w:pPr>
-      <w:r>
-        <w:rPr>
-          <w:rFonts w:ascii="Consolas" w:hAnsi="Consolas"/>
-          <w:sz w:val="17"/>
-        </w:rPr>
-        <w:t>+--------------------------------------------------------------------------------+</w:t>
+      <w:pPr/>
+      <w:r>
+        <w:drawing>
+          <wp:inline xmlns:a="http://schemas.openxmlformats.org/drawingml/2006/main" xmlns:pic="http://schemas.openxmlformats.org/drawingml/2006/picture">
+            <wp:extent cx="5486400" cy="2582003"/>
+            <wp:docPr id="5" name="Picture 5"/>
+            <wp:cNvGraphicFramePr>
+              <a:graphicFrameLocks noChangeAspect="1"/>
+            </wp:cNvGraphicFramePr>
+            <a:graphic>
+              <a:graphicData uri="http://schemas.openxmlformats.org/drawingml/2006/picture">
+                <pic:pic>
+                  <pic:nvPicPr>
+                    <pic:cNvPr id="0" name="04_hierarchy_setup.png"/>
+                    <pic:cNvPicPr/>
+                  </pic:nvPicPr>
+                  <pic:blipFill>
+                    <a:blip r:embed="rId17"/>
+                    <a:stretch>
+                      <a:fillRect/>
+                    </a:stretch>
+                  </pic:blipFill>
+                  <pic:spPr>
+                    <a:xfrm>
+                      <a:off x="0" y="0"/>
+                      <a:ext cx="5486400" cy="2582003"/>
+                    </a:xfrm>
+                    <a:prstGeom prst="rect"/>
+                  </pic:spPr>
+                </pic:pic>
+              </a:graphicData>
+            </a:graphic>
+          </wp:inline>
+        </w:drawing>
       </w:r>
     </w:p>
     <w:p>
@@ -6366,222 +5925,99 @@
         <w:pStyle w:val="Heading3"/>
       </w:pPr>
       <w:r>
-        <w:t>3.4.1 Prototype: HR queue and decision</w:t>
+        <w:t>3.4.1 Prototype (GUI): HR queue and decision</w:t>
       </w:r>
     </w:p>
     <w:p>
-      <w:pPr>
-        <w:pStyle w:val="NoSpacing"/>
-      </w:pPr>
+      <w:pPr/>
       <w:r>
         <w:rPr>
-          <w:rFonts w:ascii="Consolas" w:hAnsi="Consolas"/>
-          <w:sz w:val="17"/>
+          <w:b/>
         </w:rPr>
-        <w:t>+--------------------------------------------------------------------------------+</w:t>
+        <w:t>Screen 5 – HR queue of completed evaluations</w:t>
       </w:r>
     </w:p>
     <w:p>
-      <w:pPr>
-        <w:pStyle w:val="NoSpacing"/>
-      </w:pPr>
-      <w:r>
-        <w:rPr>
-          <w:rFonts w:ascii="Consolas" w:hAnsi="Consolas"/>
-          <w:sz w:val="17"/>
-        </w:rPr>
-        <w:t>| HR - Completed Probation Evaluations                                           |</w:t>
+      <w:pPr/>
+      <w:r>
+        <w:drawing>
+          <wp:inline xmlns:a="http://schemas.openxmlformats.org/drawingml/2006/main" xmlns:pic="http://schemas.openxmlformats.org/drawingml/2006/picture">
+            <wp:extent cx="5486400" cy="1654764"/>
+            <wp:docPr id="6" name="Picture 6"/>
+            <wp:cNvGraphicFramePr>
+              <a:graphicFrameLocks noChangeAspect="1"/>
+            </wp:cNvGraphicFramePr>
+            <a:graphic>
+              <a:graphicData uri="http://schemas.openxmlformats.org/drawingml/2006/picture">
+                <pic:pic>
+                  <pic:nvPicPr>
+                    <pic:cNvPr id="0" name="05_hr_queue.png"/>
+                    <pic:cNvPicPr/>
+                  </pic:nvPicPr>
+                  <pic:blipFill>
+                    <a:blip r:embed="rId18"/>
+                    <a:stretch>
+                      <a:fillRect/>
+                    </a:stretch>
+                  </pic:blipFill>
+                  <pic:spPr>
+                    <a:xfrm>
+                      <a:off x="0" y="0"/>
+                      <a:ext cx="5486400" cy="1654764"/>
+                    </a:xfrm>
+                    <a:prstGeom prst="rect"/>
+                  </pic:spPr>
+                </pic:pic>
+              </a:graphicData>
+            </a:graphic>
+          </wp:inline>
+        </w:drawing>
       </w:r>
     </w:p>
     <w:p>
-      <w:pPr>
-        <w:pStyle w:val="NoSpacing"/>
-      </w:pPr>
+      <w:pPr/>
       <w:r>
         <w:rPr>
-          <w:rFonts w:ascii="Consolas" w:hAnsi="Consolas"/>
-          <w:sz w:val="17"/>
+          <w:b/>
         </w:rPr>
-        <w:t>+--------------------------------------------------------------------------------+</w:t>
+        <w:t>Screen 6 – HR Decision (Confirm / Extend)</w:t>
       </w:r>
     </w:p>
     <w:p>
-      <w:pPr>
-        <w:pStyle w:val="NoSpacing"/>
-      </w:pPr>
-      <w:r>
-        <w:rPr>
-          <w:rFonts w:ascii="Consolas" w:hAnsi="Consolas"/>
-          <w:sz w:val="17"/>
-        </w:rPr>
-        <w:t>| Employee           | Dept     | Prob. End  | Recommendation | Approved by | Act |</w:t>
-      </w:r>
-    </w:p>
-    <w:p>
-      <w:pPr>
-        <w:pStyle w:val="NoSpacing"/>
-      </w:pPr>
-      <w:r>
-        <w:rPr>
-          <w:rFonts w:ascii="Consolas" w:hAnsi="Consolas"/>
-          <w:sz w:val="17"/>
-        </w:rPr>
-        <w:t>|--------------------|----------|------------|----------------|-------------|-----|</w:t>
-      </w:r>
-    </w:p>
-    <w:p>
-      <w:pPr>
-        <w:pStyle w:val="NoSpacing"/>
-      </w:pPr>
-      <w:r>
-        <w:rPr>
-          <w:rFonts w:ascii="Consolas" w:hAnsi="Consolas"/>
-          <w:sz w:val="17"/>
-        </w:rPr>
-        <w:t>| EMP-TEST-0001 Ali  | Nursing  | 25-Oct-2026| Confirm        | L2 Director | [&gt;] |</w:t>
-      </w:r>
-    </w:p>
-    <w:p>
-      <w:pPr>
-        <w:pStyle w:val="NoSpacing"/>
-      </w:pPr>
-      <w:r>
-        <w:rPr>
-          <w:rFonts w:ascii="Consolas" w:hAnsi="Consolas"/>
-          <w:sz w:val="17"/>
-        </w:rPr>
-        <w:t>| EMP-TEST-0004 Hina | Admin    | 30-Oct-2026| Extend 90 days | L1 HOD      | [&gt;] |</w:t>
-      </w:r>
-    </w:p>
-    <w:p>
-      <w:pPr>
-        <w:pStyle w:val="NoSpacing"/>
-      </w:pPr>
-      <w:r>
-        <w:rPr>
-          <w:rFonts w:ascii="Consolas" w:hAnsi="Consolas"/>
-          <w:sz w:val="17"/>
-        </w:rPr>
-        <w:t>+--------------------------------------------------------------------------------+</w:t>
-      </w:r>
-    </w:p>
-    <w:p>
-      <w:pPr>
-        <w:pStyle w:val="NoSpacing"/>
-      </w:pPr>
-      <w:r>
-        <w:rPr>
-          <w:rFonts w:ascii="Consolas" w:hAnsi="Consolas"/>
-          <w:sz w:val="17"/>
-        </w:rPr>
-      </w:r>
-    </w:p>
-    <w:p>
-      <w:pPr>
-        <w:pStyle w:val="NoSpacing"/>
-      </w:pPr>
-      <w:r>
-        <w:rPr>
-          <w:rFonts w:ascii="Consolas" w:hAnsi="Consolas"/>
-          <w:sz w:val="17"/>
-        </w:rPr>
-        <w:t>+--------------------------------------------------------------------------------+</w:t>
-      </w:r>
-    </w:p>
-    <w:p>
-      <w:pPr>
-        <w:pStyle w:val="NoSpacing"/>
-      </w:pPr>
-      <w:r>
-        <w:rPr>
-          <w:rFonts w:ascii="Consolas" w:hAnsi="Consolas"/>
-          <w:sz w:val="17"/>
-        </w:rPr>
-        <w:t>| HR Decision - EMP-TEST-0001                     Status: FORWARDED TO HR        |</w:t>
-      </w:r>
-    </w:p>
-    <w:p>
-      <w:pPr>
-        <w:pStyle w:val="NoSpacing"/>
-      </w:pPr>
-      <w:r>
-        <w:rPr>
-          <w:rFonts w:ascii="Consolas" w:hAnsi="Consolas"/>
-          <w:sz w:val="17"/>
-        </w:rPr>
-        <w:t>+--------------------------------------------------------------------------------+</w:t>
-      </w:r>
-    </w:p>
-    <w:p>
-      <w:pPr>
-        <w:pStyle w:val="NoSpacing"/>
-      </w:pPr>
-      <w:r>
-        <w:rPr>
-          <w:rFonts w:ascii="Consolas" w:hAnsi="Consolas"/>
-          <w:sz w:val="17"/>
-        </w:rPr>
-        <w:t>| [ Evaluation + approval trail, read-only ]                                     |</w:t>
-      </w:r>
-    </w:p>
-    <w:p>
-      <w:pPr>
-        <w:pStyle w:val="NoSpacing"/>
-      </w:pPr>
-      <w:r>
-        <w:rPr>
-          <w:rFonts w:ascii="Consolas" w:hAnsi="Consolas"/>
-          <w:sz w:val="17"/>
-        </w:rPr>
-        <w:t>| HR decision *   ( ) Confirm   ( ) Extend   ( ) Other (per HR policy)           |</w:t>
-      </w:r>
-    </w:p>
-    <w:p>
-      <w:pPr>
-        <w:pStyle w:val="NoSpacing"/>
-      </w:pPr>
-      <w:r>
-        <w:rPr>
-          <w:rFonts w:ascii="Consolas" w:hAnsi="Consolas"/>
-          <w:sz w:val="17"/>
-        </w:rPr>
-        <w:t>| Extension days  [ .... ]   Reason [ LOV: Probation Reasons v ]                 |</w:t>
-      </w:r>
-    </w:p>
-    <w:p>
-      <w:pPr>
-        <w:pStyle w:val="NoSpacing"/>
-      </w:pPr>
-      <w:r>
-        <w:rPr>
-          <w:rFonts w:ascii="Consolas" w:hAnsi="Consolas"/>
-          <w:sz w:val="17"/>
-        </w:rPr>
-        <w:t>| HR remarks      [..........................................................]   |</w:t>
-      </w:r>
-    </w:p>
-    <w:p>
-      <w:pPr>
-        <w:pStyle w:val="NoSpacing"/>
-      </w:pPr>
-      <w:r>
-        <w:rPr>
-          <w:rFonts w:ascii="Consolas" w:hAnsi="Consolas"/>
-          <w:sz w:val="17"/>
-        </w:rPr>
-        <w:t>|                                         [ Complete ]   [ Cancel ]              |</w:t>
-      </w:r>
-    </w:p>
-    <w:p>
-      <w:pPr>
-        <w:pStyle w:val="NoSpacing"/>
-      </w:pPr>
-      <w:r>
-        <w:rPr>
-          <w:rFonts w:ascii="Consolas" w:hAnsi="Consolas"/>
-          <w:sz w:val="17"/>
-        </w:rPr>
-        <w:t>+--------------------------------------------------------------------------------+</w:t>
+      <w:pPr/>
+      <w:r>
+        <w:drawing>
+          <wp:inline xmlns:a="http://schemas.openxmlformats.org/drawingml/2006/main" xmlns:pic="http://schemas.openxmlformats.org/drawingml/2006/picture">
+            <wp:extent cx="5486400" cy="4031349"/>
+            <wp:docPr id="7" name="Picture 7"/>
+            <wp:cNvGraphicFramePr>
+              <a:graphicFrameLocks noChangeAspect="1"/>
+            </wp:cNvGraphicFramePr>
+            <a:graphic>
+              <a:graphicData uri="http://schemas.openxmlformats.org/drawingml/2006/picture">
+                <pic:pic>
+                  <pic:nvPicPr>
+                    <pic:cNvPr id="0" name="06_hr_decision.png"/>
+                    <pic:cNvPicPr/>
+                  </pic:nvPicPr>
+                  <pic:blipFill>
+                    <a:blip r:embed="rId19"/>
+                    <a:stretch>
+                      <a:fillRect/>
+                    </a:stretch>
+                  </pic:blipFill>
+                  <pic:spPr>
+                    <a:xfrm>
+                      <a:off x="0" y="0"/>
+                      <a:ext cx="5486400" cy="4031349"/>
+                    </a:xfrm>
+                    <a:prstGeom prst="rect"/>
+                  </pic:spPr>
+                </pic:pic>
+              </a:graphicData>
+            </a:graphic>
+          </wp:inline>
+        </w:drawing>
       </w:r>
     </w:p>
     <w:p>
@@ -6871,210 +6307,53 @@
         <w:pStyle w:val="Heading3"/>
       </w:pPr>
       <w:r>
-        <w:t>3.5.1 Prototype: Monitoring and status history</w:t>
+        <w:t>3.5.1 Prototype (GUI): Monitoring and status history</w:t>
       </w:r>
     </w:p>
     <w:p>
-      <w:pPr>
-        <w:pStyle w:val="NoSpacing"/>
-      </w:pPr>
+      <w:pPr/>
       <w:r>
         <w:rPr>
-          <w:rFonts w:ascii="Consolas" w:hAnsi="Consolas"/>
-          <w:sz w:val="17"/>
+          <w:b/>
         </w:rPr>
-        <w:t>+--------------------------------------------------------------------------------+</w:t>
+        <w:t>Screen 7 – Probation Evaluation Monitoring with status history (HR)</w:t>
       </w:r>
     </w:p>
     <w:p>
-      <w:pPr>
-        <w:pStyle w:val="NoSpacing"/>
-      </w:pPr>
-      <w:r>
-        <w:rPr>
-          <w:rFonts w:ascii="Consolas" w:hAnsi="Consolas"/>
-          <w:sz w:val="17"/>
-        </w:rPr>
-        <w:t>| Probation Evaluation Monitoring (HR)                                           |</w:t>
-      </w:r>
-    </w:p>
-    <w:p>
-      <w:pPr>
-        <w:pStyle w:val="NoSpacing"/>
-      </w:pPr>
-      <w:r>
-        <w:rPr>
-          <w:rFonts w:ascii="Consolas" w:hAnsi="Consolas"/>
-          <w:sz w:val="17"/>
-        </w:rPr>
-        <w:t>| Status [All v]  Dept [All v]  Evaluator [.....]  End date [from] - [to]  (Go)  |</w:t>
-      </w:r>
-    </w:p>
-    <w:p>
-      <w:pPr>
-        <w:pStyle w:val="NoSpacing"/>
-      </w:pPr>
-      <w:r>
-        <w:rPr>
-          <w:rFonts w:ascii="Consolas" w:hAnsi="Consolas"/>
-          <w:sz w:val="17"/>
-        </w:rPr>
-        <w:t>+--------------------------------------------------------------------------------+</w:t>
-      </w:r>
-    </w:p>
-    <w:p>
-      <w:pPr>
-        <w:pStyle w:val="NoSpacing"/>
-      </w:pPr>
-      <w:r>
-        <w:rPr>
-          <w:rFonts w:ascii="Consolas" w:hAnsi="Consolas"/>
-          <w:sz w:val="17"/>
-        </w:rPr>
-        <w:t>| Employee          | Prob. End  | Status                 | With          | Flag    |</w:t>
-      </w:r>
-    </w:p>
-    <w:p>
-      <w:pPr>
-        <w:pStyle w:val="NoSpacing"/>
-      </w:pPr>
-      <w:r>
-        <w:rPr>
-          <w:rFonts w:ascii="Consolas" w:hAnsi="Consolas"/>
-          <w:sz w:val="17"/>
-        </w:rPr>
-        <w:t>|-------------------|------------|------------------------|---------------|---------|</w:t>
-      </w:r>
-    </w:p>
-    <w:p>
-      <w:pPr>
-        <w:pStyle w:val="NoSpacing"/>
-      </w:pPr>
-      <w:r>
-        <w:rPr>
-          <w:rFonts w:ascii="Consolas" w:hAnsi="Consolas"/>
-          <w:sz w:val="17"/>
-        </w:rPr>
-        <w:t>| EMP-TEST-0001 Ali | 25-Oct-2026| Pending Approval - L2  | Director Nurs.|         |</w:t>
-      </w:r>
-    </w:p>
-    <w:p>
-      <w:pPr>
-        <w:pStyle w:val="NoSpacing"/>
-      </w:pPr>
-      <w:r>
-        <w:rPr>
-          <w:rFonts w:ascii="Consolas" w:hAnsi="Consolas"/>
-          <w:sz w:val="17"/>
-        </w:rPr>
-        <w:t>| EMP-TEST-0005 Asad| 08-Oct-2026| Draft                  | EMP-TEST-0110 | OVERDUE |</w:t>
-      </w:r>
-    </w:p>
-    <w:p>
-      <w:pPr>
-        <w:pStyle w:val="NoSpacing"/>
-      </w:pPr>
-      <w:r>
-        <w:rPr>
-          <w:rFonts w:ascii="Consolas" w:hAnsi="Consolas"/>
-          <w:sz w:val="17"/>
-        </w:rPr>
-        <w:t>| EMP-TEST-0006 Zoya| 20-Oct-2026| (no supervisor)        | HR exception  | ASSIGN  |</w:t>
-      </w:r>
-    </w:p>
-    <w:p>
-      <w:pPr>
-        <w:pStyle w:val="NoSpacing"/>
-      </w:pPr>
-      <w:r>
-        <w:rPr>
-          <w:rFonts w:ascii="Consolas" w:hAnsi="Consolas"/>
-          <w:sz w:val="17"/>
-        </w:rPr>
-        <w:t>+--------------------------------------------------------------------------------+</w:t>
-      </w:r>
-    </w:p>
-    <w:p>
-      <w:pPr>
-        <w:pStyle w:val="NoSpacing"/>
-      </w:pPr>
-      <w:r>
-        <w:rPr>
-          <w:rFonts w:ascii="Consolas" w:hAnsi="Consolas"/>
-          <w:sz w:val="17"/>
-        </w:rPr>
-      </w:r>
-    </w:p>
-    <w:p>
-      <w:pPr>
-        <w:pStyle w:val="NoSpacing"/>
-      </w:pPr>
-      <w:r>
-        <w:rPr>
-          <w:rFonts w:ascii="Consolas" w:hAnsi="Consolas"/>
-          <w:sz w:val="17"/>
-        </w:rPr>
-        <w:t xml:space="preserve"> Status history - EMP-TEST-0001</w:t>
-      </w:r>
-    </w:p>
-    <w:p>
-      <w:pPr>
-        <w:pStyle w:val="NoSpacing"/>
-      </w:pPr>
-      <w:r>
-        <w:rPr>
-          <w:rFonts w:ascii="Consolas" w:hAnsi="Consolas"/>
-          <w:sz w:val="17"/>
-        </w:rPr>
-        <w:t xml:space="preserve"> | Date-time         | From               | To                    | By            | Comments |</w:t>
-      </w:r>
-    </w:p>
-    <w:p>
-      <w:pPr>
-        <w:pStyle w:val="NoSpacing"/>
-      </w:pPr>
-      <w:r>
-        <w:rPr>
-          <w:rFonts w:ascii="Consolas" w:hAnsi="Consolas"/>
-          <w:sz w:val="17"/>
-        </w:rPr>
-        <w:t xml:space="preserve"> | 10-Oct-2026 02:00 | -                  | Evaluation Pending    | SYSTEM        |          |</w:t>
-      </w:r>
-    </w:p>
-    <w:p>
-      <w:pPr>
-        <w:pStyle w:val="NoSpacing"/>
-      </w:pPr>
-      <w:r>
-        <w:rPr>
-          <w:rFonts w:ascii="Consolas" w:hAnsi="Consolas"/>
-          <w:sz w:val="17"/>
-        </w:rPr>
-        <w:t xml:space="preserve"> | 12-Oct-2026 10:15 | Evaluation Pending | Draft                 | EMP-TEST-0100 |          |</w:t>
-      </w:r>
-    </w:p>
-    <w:p>
-      <w:pPr>
-        <w:pStyle w:val="NoSpacing"/>
-      </w:pPr>
-      <w:r>
-        <w:rPr>
-          <w:rFonts w:ascii="Consolas" w:hAnsi="Consolas"/>
-          <w:sz w:val="17"/>
-        </w:rPr>
-        <w:t xml:space="preserve"> | 15-Oct-2026 09:40 | Draft              | Pending Approval - L1 | EMP-TEST-0100 |          |</w:t>
-      </w:r>
-    </w:p>
-    <w:p>
-      <w:pPr>
-        <w:pStyle w:val="NoSpacing"/>
-      </w:pPr>
-      <w:r>
-        <w:rPr>
-          <w:rFonts w:ascii="Consolas" w:hAnsi="Consolas"/>
-          <w:sz w:val="17"/>
-        </w:rPr>
-        <w:t xml:space="preserve"> | 16-Oct-2026 14:05 | Pending Appr. - L1 | Pending Approval - L2 | EMP-TEST-0200 | Agreed   |</w:t>
+      <w:pPr/>
+      <w:r>
+        <w:drawing>
+          <wp:inline xmlns:a="http://schemas.openxmlformats.org/drawingml/2006/main" xmlns:pic="http://schemas.openxmlformats.org/drawingml/2006/picture">
+            <wp:extent cx="5486400" cy="3366590"/>
+            <wp:docPr id="8" name="Picture 8"/>
+            <wp:cNvGraphicFramePr>
+              <a:graphicFrameLocks noChangeAspect="1"/>
+            </wp:cNvGraphicFramePr>
+            <a:graphic>
+              <a:graphicData uri="http://schemas.openxmlformats.org/drawingml/2006/picture">
+                <pic:pic>
+                  <pic:nvPicPr>
+                    <pic:cNvPr id="0" name="07_monitoring.png"/>
+                    <pic:cNvPicPr/>
+                  </pic:nvPicPr>
+                  <pic:blipFill>
+                    <a:blip r:embed="rId20"/>
+                    <a:stretch>
+                      <a:fillRect/>
+                    </a:stretch>
+                  </pic:blipFill>
+                  <pic:spPr>
+                    <a:xfrm>
+                      <a:off x="0" y="0"/>
+                      <a:ext cx="5486400" cy="3366590"/>
+                    </a:xfrm>
+                    <a:prstGeom prst="rect"/>
+                  </pic:spPr>
+                </pic:pic>
+              </a:graphicData>
+            </a:graphic>
+          </wp:inline>
+        </w:drawing>
       </w:r>
     </w:p>
     <w:p>

</xml_diff>

<commit_message>
Rebuild probation CR prototypes in the SKMCH GUI template and record it in the BA skill
Co-Authored-By: Claude Opus 5.5 <noreply@anthropic.com>
Claude-Session: https://claude.ai/code/session_01SLkyCeSeV96w3aeCje3oHa
</commit_message>
<xml_diff>
--- a/docs/CR-2026-XXX-PEV/CR-2026-XXX-PEV_CR_v0.2.docx
+++ b/docs/CR-2026-XXX-PEV/CR-2026-XXX-PEV_CR_v0.2.docx
@@ -340,7 +340,7 @@
           </w:tcPr>
           <w:p>
             <w:r>
-              <w:t>Merged CR template and SRS v0.3; GUI prototypes</w:t>
+              <w:t>Merged CR and SRS; GUI prototypes in SKMCH GUI template</w:t>
             </w:r>
           </w:p>
         </w:tc>
@@ -3852,7 +3852,7 @@
     <w:p>
       <w:pPr/>
       <w:r>
-        <w:t xml:space="preserve">Each requirement below follows the client template: a summary, a GUI prototype (Oracle APEX-style screen mock-up; sample data is synthetic and form content is indicative until HR supplies the evaluation form) and the detailed functional requirements (FR-NNN) with acceptance criteria. Editable prototype sources: </w:t>
+        <w:t xml:space="preserve">Each requirement below follows the client template: a summary, a GUI prototype (screen mock-up in the SKMCH APEX GUI template — title bar with page code, tabs, region headers, rating-scale panel, score bar, Preview/Save/Exit buttons; sample data is synthetic and form content is indicative until HR supplies the evaluation form) and the detailed functional requirements (FR-NNN) with acceptance criteria. Editable prototype sources: </w:t>
       </w:r>
       <w:r>
         <w:rPr>
@@ -4018,7 +4018,7 @@
         <w:rPr>
           <w:b/>
         </w:rPr>
-        <w:t>Screen 1 – My Pending Tasks (supervisor queue)</w:t>
+        <w:t>Screen 1 – My Pending Tasks (supervisor)</w:t>
       </w:r>
     </w:p>
     <w:p>
@@ -4026,7 +4026,7 @@
       <w:r>
         <w:drawing>
           <wp:inline xmlns:a="http://schemas.openxmlformats.org/drawingml/2006/main" xmlns:pic="http://schemas.openxmlformats.org/drawingml/2006/picture">
-            <wp:extent cx="5486400" cy="2193989"/>
+            <wp:extent cx="5486400" cy="1317466"/>
             <wp:docPr id="2" name="Picture 2"/>
             <wp:cNvGraphicFramePr>
               <a:graphicFrameLocks noChangeAspect="1"/>
@@ -4047,7 +4047,7 @@
                   <pic:spPr>
                     <a:xfrm>
                       <a:off x="0" y="0"/>
-                      <a:ext cx="5486400" cy="2193989"/>
+                      <a:ext cx="5486400" cy="1317466"/>
                     </a:xfrm>
                     <a:prstGeom prst="rect"/>
                   </pic:spPr>
@@ -4730,7 +4730,7 @@
         <w:rPr>
           <w:b/>
         </w:rPr>
-        <w:t>Screen 2 – Probation Evaluation form (Save as Draft / Submit)</w:t>
+        <w:t>Screen 2 – Probation Evaluation: Evaluation Criteria tab (Save as Draft / Submit)</w:t>
       </w:r>
     </w:p>
     <w:p>
@@ -4738,7 +4738,7 @@
       <w:r>
         <w:drawing>
           <wp:inline xmlns:a="http://schemas.openxmlformats.org/drawingml/2006/main" xmlns:pic="http://schemas.openxmlformats.org/drawingml/2006/picture">
-            <wp:extent cx="5486400" cy="4522072"/>
+            <wp:extent cx="5486400" cy="2645368"/>
             <wp:docPr id="3" name="Picture 3"/>
             <wp:cNvGraphicFramePr>
               <a:graphicFrameLocks noChangeAspect="1"/>
@@ -4759,7 +4759,7 @@
                   <pic:spPr>
                     <a:xfrm>
                       <a:off x="0" y="0"/>
-                      <a:ext cx="5486400" cy="4522072"/>
+                      <a:ext cx="5486400" cy="2645368"/>
                     </a:xfrm>
                     <a:prstGeom prst="rect"/>
                   </pic:spPr>
@@ -4771,556 +4771,20 @@
       </w:r>
     </w:p>
     <w:p>
-      <w:pPr>
-        <w:pStyle w:val="Heading3"/>
-      </w:pPr>
-      <w:r>
-        <w:t>3.2.2 Detailed functional requirements</w:t>
-      </w:r>
-    </w:p>
-    <w:p>
-      <w:pPr>
-        <w:pStyle w:val="Heading4"/>
-      </w:pPr>
-      <w:r>
-        <w:t>FR-007 Open evaluation from queue</w:t>
+      <w:pPr/>
+      <w:r>
+        <w:rPr>
+          <w:b/>
+        </w:rPr>
+        <w:t>Screen 3 – Probation Evaluation: Recommendation tab</w:t>
       </w:r>
     </w:p>
     <w:p>
       <w:pPr/>
       <w:r>
-        <w:rPr>
-          <w:b/>
-        </w:rPr>
-        <w:t>Description:</w:t>
-      </w:r>
-      <w:r>
-        <w:t xml:space="preserve"> The system shall allow the assigned evaluator to open a probation evaluation from their queue showing the employee's basic details (employee number, name, department, designation, joining date, probation end date) and the evaluation form. </w:t>
-      </w:r>
-      <w:r>
-        <w:rPr>
-          <w:b/>
-        </w:rPr>
-        <w:t>Priority:</w:t>
-      </w:r>
-      <w:r>
-        <w:t xml:space="preserve"> Must </w:t>
-      </w:r>
-      <w:r>
-        <w:rPr>
-          <w:b/>
-        </w:rPr>
-        <w:t>Source:</w:t>
-      </w:r>
-      <w:r>
-        <w:t xml:space="preserve"> M-02, M-03 </w:t>
-      </w:r>
-      <w:r>
-        <w:rPr>
-          <w:b/>
-        </w:rPr>
-        <w:t>Business rules:</w:t>
-      </w:r>
-      <w:r>
-        <w:t xml:space="preserve"> - </w:t>
-      </w:r>
-      <w:r>
-        <w:rPr>
-          <w:b/>
-        </w:rPr>
-        <w:t>Acceptance criteria:</w:t>
-      </w:r>
-    </w:p>
-    <w:p>
-      <w:pPr>
-        <w:pStyle w:val="ListBullet"/>
-      </w:pPr>
-      <w:r>
-        <w:t>AC1: Given a queue item assigned to the evaluator, when they open it, then the employee details and the evaluation form are shown.</w:t>
-      </w:r>
-    </w:p>
-    <w:p>
-      <w:pPr>
-        <w:pStyle w:val="ListBullet"/>
-      </w:pPr>
-      <w:r>
-        <w:t>AC2 (negative): Given a user who is not the assigned evaluator, when they try to open the evaluation by URL, then access is denied.</w:t>
-      </w:r>
-    </w:p>
-    <w:p>
-      <w:pPr/>
-      <w:r>
-        <w:rPr>
-          <w:b/>
-        </w:rPr>
-        <w:t>Notes / open questions:</w:t>
-      </w:r>
-      <w:r>
-        <w:t xml:space="preserve"> Q-05 (form content).</w:t>
-      </w:r>
-    </w:p>
-    <w:p>
-      <w:pPr>
-        <w:pStyle w:val="Heading4"/>
-      </w:pPr>
-      <w:r>
-        <w:t>FR-008 Save evaluation as Draft</w:t>
-      </w:r>
-    </w:p>
-    <w:p>
-      <w:pPr/>
-      <w:r>
-        <w:rPr>
-          <w:b/>
-        </w:rPr>
-        <w:t>Description:</w:t>
-      </w:r>
-      <w:r>
-        <w:t xml:space="preserve"> The system shall allow the evaluator to save a partially or fully completed evaluation as Draft without routing it, and to reopen and edit it later. </w:t>
-      </w:r>
-      <w:r>
-        <w:rPr>
-          <w:b/>
-        </w:rPr>
-        <w:t>Priority:</w:t>
-      </w:r>
-      <w:r>
-        <w:t xml:space="preserve"> Must </w:t>
-      </w:r>
-      <w:r>
-        <w:rPr>
-          <w:b/>
-        </w:rPr>
-        <w:t>Source:</w:t>
-      </w:r>
-      <w:r>
-        <w:t xml:space="preserve"> M-04 </w:t>
-      </w:r>
-      <w:r>
-        <w:rPr>
-          <w:b/>
-        </w:rPr>
-        <w:t>Business rules:</w:t>
-      </w:r>
-      <w:r>
-        <w:t xml:space="preserve"> RULE-04, RULE-05 </w:t>
-      </w:r>
-      <w:r>
-        <w:rPr>
-          <w:b/>
-        </w:rPr>
-        <w:t>Acceptance criteria:</w:t>
-      </w:r>
-    </w:p>
-    <w:p>
-      <w:pPr>
-        <w:pStyle w:val="ListBullet"/>
-      </w:pPr>
-      <w:r>
-        <w:t>AC1: Given an evaluation with some fields filled, when the evaluator clicks Save as Draft, then the entries are saved, the status becomes Draft, and the item stays in the evaluator's queue.</w:t>
-      </w:r>
-    </w:p>
-    <w:p>
-      <w:pPr>
-        <w:pStyle w:val="ListBullet"/>
-      </w:pPr>
-      <w:r>
-        <w:t>AC2: Given an evaluation in Draft, when the evaluator reopens it, then all previously saved values are shown and editable.</w:t>
-      </w:r>
-    </w:p>
-    <w:p>
-      <w:pPr>
-        <w:pStyle w:val="ListBullet"/>
-      </w:pPr>
-      <w:r>
-        <w:t>AC3 (negative): Given an evaluation in Draft, when any approver or HR user looks at their queue, then the evaluation is not there.</w:t>
-      </w:r>
-    </w:p>
-    <w:p>
-      <w:pPr/>
-      <w:r>
-        <w:rPr>
-          <w:b/>
-        </w:rPr>
-        <w:t>Notes / open questions:</w:t>
-      </w:r>
-      <w:r>
-        <w:t xml:space="preserve"> -</w:t>
-      </w:r>
-    </w:p>
-    <w:p>
-      <w:pPr>
-        <w:pStyle w:val="Heading4"/>
-      </w:pPr>
-      <w:r>
-        <w:t>FR-009 Submit evaluation for approval</w:t>
-      </w:r>
-    </w:p>
-    <w:p>
-      <w:pPr/>
-      <w:r>
-        <w:rPr>
-          <w:b/>
-        </w:rPr>
-        <w:t>Description:</w:t>
-      </w:r>
-      <w:r>
-        <w:t xml:space="preserve"> The system shall allow the evaluator to submit a completed evaluation for approval after validating that all mandatory fields are filled. </w:t>
-      </w:r>
-      <w:r>
-        <w:rPr>
-          <w:b/>
-        </w:rPr>
-        <w:t>Priority:</w:t>
-      </w:r>
-      <w:r>
-        <w:t xml:space="preserve"> Must </w:t>
-      </w:r>
-      <w:r>
-        <w:rPr>
-          <w:b/>
-        </w:rPr>
-        <w:t>Source:</w:t>
-      </w:r>
-      <w:r>
-        <w:t xml:space="preserve"> M-05 </w:t>
-      </w:r>
-      <w:r>
-        <w:rPr>
-          <w:b/>
-        </w:rPr>
-        <w:t>Business rules:</w:t>
-      </w:r>
-      <w:r>
-        <w:t xml:space="preserve"> RULE-05 </w:t>
-      </w:r>
-      <w:r>
-        <w:rPr>
-          <w:b/>
-        </w:rPr>
-        <w:t>Acceptance criteria:</w:t>
-      </w:r>
-    </w:p>
-    <w:p>
-      <w:pPr>
-        <w:pStyle w:val="ListBullet"/>
-      </w:pPr>
-      <w:r>
-        <w:t>AC1: Given an evaluation with all mandatory fields filled, when the evaluator clicks Submit and confirms, then the evaluation is submitted and FR-011 routing starts.</w:t>
-      </w:r>
-    </w:p>
-    <w:p>
-      <w:pPr>
-        <w:pStyle w:val="ListBullet"/>
-      </w:pPr>
-      <w:r>
-        <w:t>AC2 (negative): Given an evaluation with a mandatory field empty, when the evaluator clicks Submit, then submission is refused, the missing fields are highlighted, and the status is unchanged.</w:t>
-      </w:r>
-    </w:p>
-    <w:p>
-      <w:pPr/>
-      <w:r>
-        <w:rPr>
-          <w:b/>
-        </w:rPr>
-        <w:t>Notes / open questions:</w:t>
-      </w:r>
-      <w:r>
-        <w:t xml:space="preserve"> Q-05.</w:t>
-      </w:r>
-    </w:p>
-    <w:p>
-      <w:pPr>
-        <w:pStyle w:val="Heading4"/>
-      </w:pPr>
-      <w:r>
-        <w:t>FR-010 Lock submitted evaluation</w:t>
-      </w:r>
-    </w:p>
-    <w:p>
-      <w:pPr/>
-      <w:r>
-        <w:rPr>
-          <w:b/>
-        </w:rPr>
-        <w:t>Description:</w:t>
-      </w:r>
-      <w:r>
-        <w:t xml:space="preserve"> The system shall prevent the evaluator from changing a submitted evaluation unless it has been returned to them. </w:t>
-      </w:r>
-      <w:r>
-        <w:rPr>
-          <w:b/>
-        </w:rPr>
-        <w:t>Priority:</w:t>
-      </w:r>
-      <w:r>
-        <w:t xml:space="preserve"> Must </w:t>
-      </w:r>
-      <w:r>
-        <w:rPr>
-          <w:b/>
-        </w:rPr>
-        <w:t>Source:</w:t>
-      </w:r>
-      <w:r>
-        <w:t xml:space="preserve"> M-05 (Inferred) </w:t>
-      </w:r>
-      <w:r>
-        <w:rPr>
-          <w:b/>
-        </w:rPr>
-        <w:t>Business rules:</w:t>
-      </w:r>
-      <w:r>
-        <w:t xml:space="preserve"> RULE-08 </w:t>
-      </w:r>
-      <w:r>
-        <w:rPr>
-          <w:b/>
-        </w:rPr>
-        <w:t>Acceptance criteria:</w:t>
-      </w:r>
-    </w:p>
-    <w:p>
-      <w:pPr>
-        <w:pStyle w:val="ListBullet"/>
-      </w:pPr>
-      <w:r>
-        <w:t>AC1: Given a submitted evaluation, when the evaluator opens it, then it is read-only.</w:t>
-      </w:r>
-    </w:p>
-    <w:p>
-      <w:pPr>
-        <w:pStyle w:val="ListBullet"/>
-      </w:pPr>
-      <w:r>
-        <w:t>AC2: Given an evaluation returned by an approver, when the evaluator opens it, then it is editable again and can be re-submitted.</w:t>
-      </w:r>
-    </w:p>
-    <w:p>
-      <w:pPr/>
-      <w:r>
-        <w:rPr>
-          <w:b/>
-        </w:rPr>
-        <w:t>Notes / open questions:</w:t>
-      </w:r>
-      <w:r>
-        <w:t xml:space="preserve"> Q-07.</w:t>
-      </w:r>
-    </w:p>
-    <w:p>
-      <w:pPr>
-        <w:pStyle w:val="Heading2"/>
-      </w:pPr>
-      <w:r>
-        <w:t>3.3 Requirement 3: Routing through the configured approval hierarchy</w:t>
-      </w:r>
-    </w:p>
-    <w:p>
-      <w:pPr/>
-      <w:r>
-        <w:rPr>
-          <w:b/>
-        </w:rPr>
-        <w:t>Description:</w:t>
-      </w:r>
-      <w:r>
-        <w:t xml:space="preserve"> On Submit, the system shall route the evaluation to the approval hierarchy configured for probation evaluations, one level at a time in order.</w:t>
-      </w:r>
-    </w:p>
-    <w:p>
-      <w:pPr>
-        <w:pStyle w:val="ListBullet"/>
-      </w:pPr>
-      <w:r>
-        <w:rPr>
-          <w:b/>
-        </w:rPr>
-        <w:t>Approve</w:t>
-      </w:r>
-      <w:r>
-        <w:t xml:space="preserve"> (optional comments): moves the evaluation to the next level.</w:t>
-      </w:r>
-    </w:p>
-    <w:p>
-      <w:pPr>
-        <w:pStyle w:val="ListBullet"/>
-      </w:pPr>
-      <w:r>
-        <w:rPr>
-          <w:b/>
-        </w:rPr>
-        <w:t>Return</w:t>
-      </w:r>
-      <w:r>
-        <w:t xml:space="preserve"> (comments mandatory): sends it back to the evaluator (status Returned). The evaluator corrects it and re-submits.</w:t>
-      </w:r>
-    </w:p>
-    <w:p>
-      <w:pPr>
-        <w:pStyle w:val="ListBullet"/>
-      </w:pPr>
-      <w:r>
-        <w:t>No one approves their own case. If the evaluator is also the approver at a level, that level is skipped and the reason is logged. If there is no next level, the evaluation goes to the HR exception list.</w:t>
-      </w:r>
-    </w:p>
-    <w:p>
-      <w:pPr>
-        <w:pStyle w:val="ListBullet"/>
-      </w:pPr>
-      <w:r>
-        <w:t>If an approver's level cannot be resolved, the evaluation goes to the HR exception list. It is never lost.</w:t>
-      </w:r>
-    </w:p>
-    <w:p>
-      <w:pPr>
-        <w:pStyle w:val="ListBullet"/>
-      </w:pPr>
-      <w:r>
-        <w:rPr>
-          <w:b/>
-        </w:rPr>
-        <w:t>Approver on leave:</w:t>
-      </w:r>
-      <w:r>
-        <w:t xml:space="preserve"> the evaluation goes to their acting-for person (</w:t>
-      </w:r>
-      <w:r>
-        <w:rPr>
-          <w:rFonts w:ascii="Consolas" w:hAnsi="Consolas"/>
-          <w:sz w:val="18"/>
-        </w:rPr>
-        <w:t>HRD.ACTING_FOR</w:t>
-      </w:r>
-      <w:r>
-        <w:t>), to be confirmed by HR.</w:t>
-      </w:r>
-    </w:p>
-    <w:p>
-      <w:pPr>
-        <w:pStyle w:val="ListBullet"/>
-      </w:pPr>
-      <w:r>
-        <w:t xml:space="preserve">The hierarchy levels (for example L1 = HOD, L2 = Director, by department or grade) are maintained by the HR Administrator. </w:t>
-      </w:r>
-      <w:r>
-        <w:rPr>
-          <w:b/>
-        </w:rPr>
-        <w:t>The levels are pending from HR.</w:t>
-      </w:r>
-    </w:p>
-    <w:p>
-      <w:pPr>
-        <w:pStyle w:val="ListBullet"/>
-      </w:pPr>
-      <w:r>
-        <w:rPr>
-          <w:b/>
-        </w:rPr>
-        <w:t>Recommended approach:</w:t>
-      </w:r>
-      <w:r>
-        <w:t xml:space="preserve"> reuse the existing HRD appraisal routing engine (</w:t>
-      </w:r>
-      <w:r>
-        <w:rPr>
-          <w:rFonts w:ascii="Consolas" w:hAnsi="Consolas"/>
-          <w:sz w:val="18"/>
-        </w:rPr>
-        <w:t>PA_HIERARCHY</w:t>
-      </w:r>
-      <w:r>
-        <w:t xml:space="preserve">, </w:t>
-      </w:r>
-      <w:r>
-        <w:rPr>
-          <w:rFonts w:ascii="Consolas" w:hAnsi="Consolas"/>
-          <w:sz w:val="18"/>
-        </w:rPr>
-        <w:t>PA_PERFORM_APPRAISER</w:t>
-      </w:r>
-      <w:r>
-        <w:t xml:space="preserve">, </w:t>
-      </w:r>
-      <w:r>
-        <w:rPr>
-          <w:rFonts w:ascii="Consolas" w:hAnsi="Consolas"/>
-          <w:sz w:val="18"/>
-        </w:rPr>
-        <w:t>PKG_PERFORMANCE_APPRAISAL</w:t>
-      </w:r>
-      <w:r>
-        <w:t>), which already supports Recommend / Approve / Final / Send-back and acting-for. The final decision is made at the design stage.</w:t>
-      </w:r>
-    </w:p>
-    <w:p>
-      <w:pPr/>
-      <w:r>
-        <w:rPr>
-          <w:b/>
-        </w:rPr>
-        <w:t>Acceptance (summary):</w:t>
-      </w:r>
-    </w:p>
-    <w:p>
-      <w:pPr>
-        <w:pStyle w:val="ListBullet"/>
-      </w:pPr>
-      <w:r>
-        <w:t>After Level 1 approves, the evaluation appears in the Level 2 queue and leaves the Level 1 queue.</w:t>
-      </w:r>
-    </w:p>
-    <w:p>
-      <w:pPr>
-        <w:pStyle w:val="ListBullet"/>
-      </w:pPr>
-      <w:r>
-        <w:t>A Return without comments is refused.</w:t>
-      </w:r>
-    </w:p>
-    <w:p>
-      <w:pPr>
-        <w:pStyle w:val="ListBullet"/>
-      </w:pPr>
-      <w:r>
-        <w:t>The evaluated employee never receives their own evaluation in their queue.</w:t>
-      </w:r>
-    </w:p>
-    <w:p>
-      <w:pPr/>
-      <w:r>
-        <w:rPr>
-          <w:i/>
-        </w:rPr>
-        <w:t>Traceability: FR-011 – FR-014, RULE-06, RULE-09.</w:t>
-      </w:r>
-    </w:p>
-    <w:p>
-      <w:pPr>
-        <w:pStyle w:val="Heading3"/>
-      </w:pPr>
-      <w:r>
-        <w:t>3.3.1 Prototype (GUI): Approver screen and hierarchy setup</w:t>
-      </w:r>
-    </w:p>
-    <w:p>
-      <w:pPr/>
-      <w:r>
-        <w:rPr>
-          <w:b/>
-        </w:rPr>
-        <w:t>Screen 3 – Approver view (Approve / Return)</w:t>
-      </w:r>
-    </w:p>
-    <w:p>
-      <w:pPr/>
-      <w:r>
         <w:drawing>
           <wp:inline xmlns:a="http://schemas.openxmlformats.org/drawingml/2006/main" xmlns:pic="http://schemas.openxmlformats.org/drawingml/2006/picture">
-            <wp:extent cx="5486400" cy="5295246"/>
+            <wp:extent cx="5486400" cy="1938371"/>
             <wp:docPr id="4" name="Picture 4"/>
             <wp:cNvGraphicFramePr>
               <a:graphicFrameLocks noChangeAspect="1"/>
@@ -5329,7 +4793,7 @@
               <a:graphicData uri="http://schemas.openxmlformats.org/drawingml/2006/picture">
                 <pic:pic>
                   <pic:nvPicPr>
-                    <pic:cNvPr id="0" name="03_approver.png"/>
+                    <pic:cNvPr id="0" name="03_evaluation_recommendation.png"/>
                     <pic:cNvPicPr/>
                   </pic:nvPicPr>
                   <pic:blipFill>
@@ -5341,7 +4805,7 @@
                   <pic:spPr>
                     <a:xfrm>
                       <a:off x="0" y="0"/>
-                      <a:ext cx="5486400" cy="5295246"/>
+                      <a:ext cx="5486400" cy="1938371"/>
                     </a:xfrm>
                     <a:prstGeom prst="rect"/>
                   </pic:spPr>
@@ -5353,20 +4817,556 @@
       </w:r>
     </w:p>
     <w:p>
+      <w:pPr>
+        <w:pStyle w:val="Heading3"/>
+      </w:pPr>
+      <w:r>
+        <w:t>3.2.2 Detailed functional requirements</w:t>
+      </w:r>
+    </w:p>
+    <w:p>
+      <w:pPr>
+        <w:pStyle w:val="Heading4"/>
+      </w:pPr>
+      <w:r>
+        <w:t>FR-007 Open evaluation from queue</w:t>
+      </w:r>
+    </w:p>
+    <w:p>
       <w:pPr/>
       <w:r>
         <w:rPr>
           <w:b/>
         </w:rPr>
-        <w:t>Screen 4 – Probation Approval Hierarchy Setup (HR Administrator)</w:t>
+        <w:t>Description:</w:t>
+      </w:r>
+      <w:r>
+        <w:t xml:space="preserve"> The system shall allow the assigned evaluator to open a probation evaluation from their queue showing the employee's basic details (employee number, name, department, designation, joining date, probation end date) and the evaluation form. </w:t>
+      </w:r>
+      <w:r>
+        <w:rPr>
+          <w:b/>
+        </w:rPr>
+        <w:t>Priority:</w:t>
+      </w:r>
+      <w:r>
+        <w:t xml:space="preserve"> Must </w:t>
+      </w:r>
+      <w:r>
+        <w:rPr>
+          <w:b/>
+        </w:rPr>
+        <w:t>Source:</w:t>
+      </w:r>
+      <w:r>
+        <w:t xml:space="preserve"> M-02, M-03 </w:t>
+      </w:r>
+      <w:r>
+        <w:rPr>
+          <w:b/>
+        </w:rPr>
+        <w:t>Business rules:</w:t>
+      </w:r>
+      <w:r>
+        <w:t xml:space="preserve"> - </w:t>
+      </w:r>
+      <w:r>
+        <w:rPr>
+          <w:b/>
+        </w:rPr>
+        <w:t>Acceptance criteria:</w:t>
+      </w:r>
+    </w:p>
+    <w:p>
+      <w:pPr>
+        <w:pStyle w:val="ListBullet"/>
+      </w:pPr>
+      <w:r>
+        <w:t>AC1: Given a queue item assigned to the evaluator, when they open it, then the employee details and the evaluation form are shown.</w:t>
+      </w:r>
+    </w:p>
+    <w:p>
+      <w:pPr>
+        <w:pStyle w:val="ListBullet"/>
+      </w:pPr>
+      <w:r>
+        <w:t>AC2 (negative): Given a user who is not the assigned evaluator, when they try to open the evaluation by URL, then access is denied.</w:t>
       </w:r>
     </w:p>
     <w:p>
       <w:pPr/>
       <w:r>
+        <w:rPr>
+          <w:b/>
+        </w:rPr>
+        <w:t>Notes / open questions:</w:t>
+      </w:r>
+      <w:r>
+        <w:t xml:space="preserve"> Q-05 (form content).</w:t>
+      </w:r>
+    </w:p>
+    <w:p>
+      <w:pPr>
+        <w:pStyle w:val="Heading4"/>
+      </w:pPr>
+      <w:r>
+        <w:t>FR-008 Save evaluation as Draft</w:t>
+      </w:r>
+    </w:p>
+    <w:p>
+      <w:pPr/>
+      <w:r>
+        <w:rPr>
+          <w:b/>
+        </w:rPr>
+        <w:t>Description:</w:t>
+      </w:r>
+      <w:r>
+        <w:t xml:space="preserve"> The system shall allow the evaluator to save a partially or fully completed evaluation as Draft without routing it, and to reopen and edit it later. </w:t>
+      </w:r>
+      <w:r>
+        <w:rPr>
+          <w:b/>
+        </w:rPr>
+        <w:t>Priority:</w:t>
+      </w:r>
+      <w:r>
+        <w:t xml:space="preserve"> Must </w:t>
+      </w:r>
+      <w:r>
+        <w:rPr>
+          <w:b/>
+        </w:rPr>
+        <w:t>Source:</w:t>
+      </w:r>
+      <w:r>
+        <w:t xml:space="preserve"> M-04 </w:t>
+      </w:r>
+      <w:r>
+        <w:rPr>
+          <w:b/>
+        </w:rPr>
+        <w:t>Business rules:</w:t>
+      </w:r>
+      <w:r>
+        <w:t xml:space="preserve"> RULE-04, RULE-05 </w:t>
+      </w:r>
+      <w:r>
+        <w:rPr>
+          <w:b/>
+        </w:rPr>
+        <w:t>Acceptance criteria:</w:t>
+      </w:r>
+    </w:p>
+    <w:p>
+      <w:pPr>
+        <w:pStyle w:val="ListBullet"/>
+      </w:pPr>
+      <w:r>
+        <w:t>AC1: Given an evaluation with some fields filled, when the evaluator clicks Save as Draft, then the entries are saved, the status becomes Draft, and the item stays in the evaluator's queue.</w:t>
+      </w:r>
+    </w:p>
+    <w:p>
+      <w:pPr>
+        <w:pStyle w:val="ListBullet"/>
+      </w:pPr>
+      <w:r>
+        <w:t>AC2: Given an evaluation in Draft, when the evaluator reopens it, then all previously saved values are shown and editable.</w:t>
+      </w:r>
+    </w:p>
+    <w:p>
+      <w:pPr>
+        <w:pStyle w:val="ListBullet"/>
+      </w:pPr>
+      <w:r>
+        <w:t>AC3 (negative): Given an evaluation in Draft, when any approver or HR user looks at their queue, then the evaluation is not there.</w:t>
+      </w:r>
+    </w:p>
+    <w:p>
+      <w:pPr/>
+      <w:r>
+        <w:rPr>
+          <w:b/>
+        </w:rPr>
+        <w:t>Notes / open questions:</w:t>
+      </w:r>
+      <w:r>
+        <w:t xml:space="preserve"> -</w:t>
+      </w:r>
+    </w:p>
+    <w:p>
+      <w:pPr>
+        <w:pStyle w:val="Heading4"/>
+      </w:pPr>
+      <w:r>
+        <w:t>FR-009 Submit evaluation for approval</w:t>
+      </w:r>
+    </w:p>
+    <w:p>
+      <w:pPr/>
+      <w:r>
+        <w:rPr>
+          <w:b/>
+        </w:rPr>
+        <w:t>Description:</w:t>
+      </w:r>
+      <w:r>
+        <w:t xml:space="preserve"> The system shall allow the evaluator to submit a completed evaluation for approval after validating that all mandatory fields are filled. </w:t>
+      </w:r>
+      <w:r>
+        <w:rPr>
+          <w:b/>
+        </w:rPr>
+        <w:t>Priority:</w:t>
+      </w:r>
+      <w:r>
+        <w:t xml:space="preserve"> Must </w:t>
+      </w:r>
+      <w:r>
+        <w:rPr>
+          <w:b/>
+        </w:rPr>
+        <w:t>Source:</w:t>
+      </w:r>
+      <w:r>
+        <w:t xml:space="preserve"> M-05 </w:t>
+      </w:r>
+      <w:r>
+        <w:rPr>
+          <w:b/>
+        </w:rPr>
+        <w:t>Business rules:</w:t>
+      </w:r>
+      <w:r>
+        <w:t xml:space="preserve"> RULE-05 </w:t>
+      </w:r>
+      <w:r>
+        <w:rPr>
+          <w:b/>
+        </w:rPr>
+        <w:t>Acceptance criteria:</w:t>
+      </w:r>
+    </w:p>
+    <w:p>
+      <w:pPr>
+        <w:pStyle w:val="ListBullet"/>
+      </w:pPr>
+      <w:r>
+        <w:t>AC1: Given an evaluation with all mandatory fields filled, when the evaluator clicks Submit and confirms, then the evaluation is submitted and FR-011 routing starts.</w:t>
+      </w:r>
+    </w:p>
+    <w:p>
+      <w:pPr>
+        <w:pStyle w:val="ListBullet"/>
+      </w:pPr>
+      <w:r>
+        <w:t>AC2 (negative): Given an evaluation with a mandatory field empty, when the evaluator clicks Submit, then submission is refused, the missing fields are highlighted, and the status is unchanged.</w:t>
+      </w:r>
+    </w:p>
+    <w:p>
+      <w:pPr/>
+      <w:r>
+        <w:rPr>
+          <w:b/>
+        </w:rPr>
+        <w:t>Notes / open questions:</w:t>
+      </w:r>
+      <w:r>
+        <w:t xml:space="preserve"> Q-05.</w:t>
+      </w:r>
+    </w:p>
+    <w:p>
+      <w:pPr>
+        <w:pStyle w:val="Heading4"/>
+      </w:pPr>
+      <w:r>
+        <w:t>FR-010 Lock submitted evaluation</w:t>
+      </w:r>
+    </w:p>
+    <w:p>
+      <w:pPr/>
+      <w:r>
+        <w:rPr>
+          <w:b/>
+        </w:rPr>
+        <w:t>Description:</w:t>
+      </w:r>
+      <w:r>
+        <w:t xml:space="preserve"> The system shall prevent the evaluator from changing a submitted evaluation unless it has been returned to them. </w:t>
+      </w:r>
+      <w:r>
+        <w:rPr>
+          <w:b/>
+        </w:rPr>
+        <w:t>Priority:</w:t>
+      </w:r>
+      <w:r>
+        <w:t xml:space="preserve"> Must </w:t>
+      </w:r>
+      <w:r>
+        <w:rPr>
+          <w:b/>
+        </w:rPr>
+        <w:t>Source:</w:t>
+      </w:r>
+      <w:r>
+        <w:t xml:space="preserve"> M-05 (Inferred) </w:t>
+      </w:r>
+      <w:r>
+        <w:rPr>
+          <w:b/>
+        </w:rPr>
+        <w:t>Business rules:</w:t>
+      </w:r>
+      <w:r>
+        <w:t xml:space="preserve"> RULE-08 </w:t>
+      </w:r>
+      <w:r>
+        <w:rPr>
+          <w:b/>
+        </w:rPr>
+        <w:t>Acceptance criteria:</w:t>
+      </w:r>
+    </w:p>
+    <w:p>
+      <w:pPr>
+        <w:pStyle w:val="ListBullet"/>
+      </w:pPr>
+      <w:r>
+        <w:t>AC1: Given a submitted evaluation, when the evaluator opens it, then it is read-only.</w:t>
+      </w:r>
+    </w:p>
+    <w:p>
+      <w:pPr>
+        <w:pStyle w:val="ListBullet"/>
+      </w:pPr>
+      <w:r>
+        <w:t>AC2: Given an evaluation returned by an approver, when the evaluator opens it, then it is editable again and can be re-submitted.</w:t>
+      </w:r>
+    </w:p>
+    <w:p>
+      <w:pPr/>
+      <w:r>
+        <w:rPr>
+          <w:b/>
+        </w:rPr>
+        <w:t>Notes / open questions:</w:t>
+      </w:r>
+      <w:r>
+        <w:t xml:space="preserve"> Q-07.</w:t>
+      </w:r>
+    </w:p>
+    <w:p>
+      <w:pPr>
+        <w:pStyle w:val="Heading2"/>
+      </w:pPr>
+      <w:r>
+        <w:t>3.3 Requirement 3: Routing through the configured approval hierarchy</w:t>
+      </w:r>
+    </w:p>
+    <w:p>
+      <w:pPr/>
+      <w:r>
+        <w:rPr>
+          <w:b/>
+        </w:rPr>
+        <w:t>Description:</w:t>
+      </w:r>
+      <w:r>
+        <w:t xml:space="preserve"> On Submit, the system shall route the evaluation to the approval hierarchy configured for probation evaluations, one level at a time in order.</w:t>
+      </w:r>
+    </w:p>
+    <w:p>
+      <w:pPr>
+        <w:pStyle w:val="ListBullet"/>
+      </w:pPr>
+      <w:r>
+        <w:rPr>
+          <w:b/>
+        </w:rPr>
+        <w:t>Approve</w:t>
+      </w:r>
+      <w:r>
+        <w:t xml:space="preserve"> (optional comments): moves the evaluation to the next level.</w:t>
+      </w:r>
+    </w:p>
+    <w:p>
+      <w:pPr>
+        <w:pStyle w:val="ListBullet"/>
+      </w:pPr>
+      <w:r>
+        <w:rPr>
+          <w:b/>
+        </w:rPr>
+        <w:t>Return</w:t>
+      </w:r>
+      <w:r>
+        <w:t xml:space="preserve"> (comments mandatory): sends it back to the evaluator (status Returned). The evaluator corrects it and re-submits.</w:t>
+      </w:r>
+    </w:p>
+    <w:p>
+      <w:pPr>
+        <w:pStyle w:val="ListBullet"/>
+      </w:pPr>
+      <w:r>
+        <w:t>No one approves their own case. If the evaluator is also the approver at a level, that level is skipped and the reason is logged. If there is no next level, the evaluation goes to the HR exception list.</w:t>
+      </w:r>
+    </w:p>
+    <w:p>
+      <w:pPr>
+        <w:pStyle w:val="ListBullet"/>
+      </w:pPr>
+      <w:r>
+        <w:t>If an approver's level cannot be resolved, the evaluation goes to the HR exception list. It is never lost.</w:t>
+      </w:r>
+    </w:p>
+    <w:p>
+      <w:pPr>
+        <w:pStyle w:val="ListBullet"/>
+      </w:pPr>
+      <w:r>
+        <w:rPr>
+          <w:b/>
+        </w:rPr>
+        <w:t>Approver on leave:</w:t>
+      </w:r>
+      <w:r>
+        <w:t xml:space="preserve"> the evaluation goes to their acting-for person (</w:t>
+      </w:r>
+      <w:r>
+        <w:rPr>
+          <w:rFonts w:ascii="Consolas" w:hAnsi="Consolas"/>
+          <w:sz w:val="18"/>
+        </w:rPr>
+        <w:t>HRD.ACTING_FOR</w:t>
+      </w:r>
+      <w:r>
+        <w:t>), to be confirmed by HR.</w:t>
+      </w:r>
+    </w:p>
+    <w:p>
+      <w:pPr>
+        <w:pStyle w:val="ListBullet"/>
+      </w:pPr>
+      <w:r>
+        <w:t xml:space="preserve">The hierarchy levels (for example L1 = HOD, L2 = Director, by department or grade) are maintained by the HR Administrator. </w:t>
+      </w:r>
+      <w:r>
+        <w:rPr>
+          <w:b/>
+        </w:rPr>
+        <w:t>The levels are pending from HR.</w:t>
+      </w:r>
+    </w:p>
+    <w:p>
+      <w:pPr>
+        <w:pStyle w:val="ListBullet"/>
+      </w:pPr>
+      <w:r>
+        <w:rPr>
+          <w:b/>
+        </w:rPr>
+        <w:t>Recommended approach:</w:t>
+      </w:r>
+      <w:r>
+        <w:t xml:space="preserve"> reuse the existing HRD appraisal routing engine (</w:t>
+      </w:r>
+      <w:r>
+        <w:rPr>
+          <w:rFonts w:ascii="Consolas" w:hAnsi="Consolas"/>
+          <w:sz w:val="18"/>
+        </w:rPr>
+        <w:t>PA_HIERARCHY</w:t>
+      </w:r>
+      <w:r>
+        <w:t xml:space="preserve">, </w:t>
+      </w:r>
+      <w:r>
+        <w:rPr>
+          <w:rFonts w:ascii="Consolas" w:hAnsi="Consolas"/>
+          <w:sz w:val="18"/>
+        </w:rPr>
+        <w:t>PA_PERFORM_APPRAISER</w:t>
+      </w:r>
+      <w:r>
+        <w:t xml:space="preserve">, </w:t>
+      </w:r>
+      <w:r>
+        <w:rPr>
+          <w:rFonts w:ascii="Consolas" w:hAnsi="Consolas"/>
+          <w:sz w:val="18"/>
+        </w:rPr>
+        <w:t>PKG_PERFORMANCE_APPRAISAL</w:t>
+      </w:r>
+      <w:r>
+        <w:t>), which already supports Recommend / Approve / Final / Send-back and acting-for. The final decision is made at the design stage.</w:t>
+      </w:r>
+    </w:p>
+    <w:p>
+      <w:pPr/>
+      <w:r>
+        <w:rPr>
+          <w:b/>
+        </w:rPr>
+        <w:t>Acceptance (summary):</w:t>
+      </w:r>
+    </w:p>
+    <w:p>
+      <w:pPr>
+        <w:pStyle w:val="ListBullet"/>
+      </w:pPr>
+      <w:r>
+        <w:t>After Level 1 approves, the evaluation appears in the Level 2 queue and leaves the Level 1 queue.</w:t>
+      </w:r>
+    </w:p>
+    <w:p>
+      <w:pPr>
+        <w:pStyle w:val="ListBullet"/>
+      </w:pPr>
+      <w:r>
+        <w:t>A Return without comments is refused.</w:t>
+      </w:r>
+    </w:p>
+    <w:p>
+      <w:pPr>
+        <w:pStyle w:val="ListBullet"/>
+      </w:pPr>
+      <w:r>
+        <w:t>The evaluated employee never receives their own evaluation in their queue.</w:t>
+      </w:r>
+    </w:p>
+    <w:p>
+      <w:pPr/>
+      <w:r>
+        <w:rPr>
+          <w:i/>
+        </w:rPr>
+        <w:t>Traceability: FR-011 – FR-014, RULE-06, RULE-09.</w:t>
+      </w:r>
+    </w:p>
+    <w:p>
+      <w:pPr>
+        <w:pStyle w:val="Heading3"/>
+      </w:pPr>
+      <w:r>
+        <w:t>3.3.1 Prototype (GUI): Approver screen and hierarchy setup</w:t>
+      </w:r>
+    </w:p>
+    <w:p>
+      <w:pPr/>
+      <w:r>
+        <w:rPr>
+          <w:b/>
+        </w:rPr>
+        <w:t>Screen 4 – Approval view (Approve / Return to Evaluator)</w:t>
+      </w:r>
+    </w:p>
+    <w:p>
+      <w:pPr/>
+      <w:r>
         <w:drawing>
           <wp:inline xmlns:a="http://schemas.openxmlformats.org/drawingml/2006/main" xmlns:pic="http://schemas.openxmlformats.org/drawingml/2006/picture">
-            <wp:extent cx="5486400" cy="2582003"/>
+            <wp:extent cx="5486400" cy="3255838"/>
             <wp:docPr id="5" name="Picture 5"/>
             <wp:cNvGraphicFramePr>
               <a:graphicFrameLocks noChangeAspect="1"/>
@@ -5375,7 +5375,7 @@
               <a:graphicData uri="http://schemas.openxmlformats.org/drawingml/2006/picture">
                 <pic:pic>
                   <pic:nvPicPr>
-                    <pic:cNvPr id="0" name="04_hierarchy_setup.png"/>
+                    <pic:cNvPr id="0" name="04_approver.png"/>
                     <pic:cNvPicPr/>
                   </pic:nvPicPr>
                   <pic:blipFill>
@@ -5387,7 +5387,7 @@
                   <pic:spPr>
                     <a:xfrm>
                       <a:off x="0" y="0"/>
-                      <a:ext cx="5486400" cy="2582003"/>
+                      <a:ext cx="5486400" cy="3255838"/>
                     </a:xfrm>
                     <a:prstGeom prst="rect"/>
                   </pic:spPr>
@@ -5399,550 +5399,20 @@
       </w:r>
     </w:p>
     <w:p>
-      <w:pPr>
-        <w:pStyle w:val="Heading3"/>
-      </w:pPr>
-      <w:r>
-        <w:t>3.3.2 Detailed functional requirements</w:t>
-      </w:r>
-    </w:p>
-    <w:p>
-      <w:pPr>
-        <w:pStyle w:val="Heading4"/>
-      </w:pPr>
-      <w:r>
-        <w:t>FR-011 Route to configured approval hierarchy</w:t>
+      <w:pPr/>
+      <w:r>
+        <w:rPr>
+          <w:b/>
+        </w:rPr>
+        <w:t>Screen 5 – Probation Approval Hierarchy Setup (HR Administrator)</w:t>
       </w:r>
     </w:p>
     <w:p>
       <w:pPr/>
       <w:r>
-        <w:rPr>
-          <w:b/>
-        </w:rPr>
-        <w:t>Description:</w:t>
-      </w:r>
-      <w:r>
-        <w:t xml:space="preserve"> The system shall route a submitted evaluation to the first level of the approval hierarchy configured for probation evaluations, resolving the approver for that level from the evaluated employee's department as on the submission date (changed in v0.2, RV-12; pending Q-16). </w:t>
-      </w:r>
-      <w:r>
-        <w:rPr>
-          <w:b/>
-        </w:rPr>
-        <w:t>Priority:</w:t>
-      </w:r>
-      <w:r>
-        <w:t xml:space="preserve"> Must </w:t>
-      </w:r>
-      <w:r>
-        <w:rPr>
-          <w:b/>
-        </w:rPr>
-        <w:t>Source:</w:t>
-      </w:r>
-      <w:r>
-        <w:t xml:space="preserve"> M-06 </w:t>
-      </w:r>
-      <w:r>
-        <w:rPr>
-          <w:b/>
-        </w:rPr>
-        <w:t>Business rules:</w:t>
-      </w:r>
-      <w:r>
-        <w:t xml:space="preserve"> RULE-06, RULE-09 </w:t>
-      </w:r>
-      <w:r>
-        <w:rPr>
-          <w:b/>
-        </w:rPr>
-        <w:t>Acceptance criteria:</w:t>
-      </w:r>
-    </w:p>
-    <w:p>
-      <w:pPr>
-        <w:pStyle w:val="ListBullet"/>
-      </w:pPr>
-      <w:r>
-        <w:t>AC1: Given a configured hierarchy of Level 1 = HOD and Level 2 = Director, when an evaluation for an employee in Department D-TEST is submitted, then it appears in the D-TEST HOD's approval queue and the status shows Pending Approval – Level 1.</w:t>
-      </w:r>
-    </w:p>
-    <w:p>
-      <w:pPr>
-        <w:pStyle w:val="ListBullet"/>
-      </w:pPr>
-      <w:r>
-        <w:t>AC2 (negative): Given a hierarchy level whose approver cannot be resolved, when the evaluation reaches that level, then it is placed on the HR exception list with the reason "Approver not defined for level n" and is not lost.</w:t>
-      </w:r>
-    </w:p>
-    <w:p>
-      <w:pPr/>
-      <w:r>
-        <w:rPr>
-          <w:b/>
-        </w:rPr>
-        <w:t>Notes / open questions:</w:t>
-      </w:r>
-      <w:r>
-        <w:t xml:space="preserve"> Q-15 (is there an existing approval hierarchy setup), Q-16 (hierarchy basis).</w:t>
-      </w:r>
-    </w:p>
-    <w:p>
-      <w:pPr>
-        <w:pStyle w:val="Heading4"/>
-      </w:pPr>
-      <w:r>
-        <w:t>FR-012 Approve at a level</w:t>
-      </w:r>
-    </w:p>
-    <w:p>
-      <w:pPr/>
-      <w:r>
-        <w:rPr>
-          <w:b/>
-        </w:rPr>
-        <w:t>Description:</w:t>
-      </w:r>
-      <w:r>
-        <w:t xml:space="preserve"> The system shall allow the approver at the current level to approve the evaluation, with optional comments, and move it to the next configured level. </w:t>
-      </w:r>
-      <w:r>
-        <w:rPr>
-          <w:b/>
-        </w:rPr>
-        <w:t>Priority:</w:t>
-      </w:r>
-      <w:r>
-        <w:t xml:space="preserve"> Must </w:t>
-      </w:r>
-      <w:r>
-        <w:rPr>
-          <w:b/>
-        </w:rPr>
-        <w:t>Source:</w:t>
-      </w:r>
-      <w:r>
-        <w:t xml:space="preserve"> M-06 </w:t>
-      </w:r>
-      <w:r>
-        <w:rPr>
-          <w:b/>
-        </w:rPr>
-        <w:t>Business rules:</w:t>
-      </w:r>
-      <w:r>
-        <w:t xml:space="preserve"> RULE-06 </w:t>
-      </w:r>
-      <w:r>
-        <w:rPr>
-          <w:b/>
-        </w:rPr>
-        <w:t>Acceptance criteria:</w:t>
-      </w:r>
-    </w:p>
-    <w:p>
-      <w:pPr>
-        <w:pStyle w:val="ListBullet"/>
-      </w:pPr>
-      <w:r>
-        <w:t>AC1: Given an evaluation at Level 1 of a 2-level hierarchy, when the Level 1 approver approves, then it moves to the Level 2 approver's queue and leaves the Level 1 queue.</w:t>
-      </w:r>
-    </w:p>
-    <w:p>
-      <w:pPr>
-        <w:pStyle w:val="ListBullet"/>
-      </w:pPr>
-      <w:r>
-        <w:t>AC2 (negative): Given an evaluation at Level 2, when the Level 1 approver tries to approve it again, then the action is not available.</w:t>
-      </w:r>
-    </w:p>
-    <w:p>
-      <w:pPr/>
-      <w:r>
-        <w:rPr>
-          <w:b/>
-        </w:rPr>
-        <w:t>Notes / open questions:</w:t>
-      </w:r>
-      <w:r>
-        <w:t xml:space="preserve"> -</w:t>
-      </w:r>
-    </w:p>
-    <w:p>
-      <w:pPr>
-        <w:pStyle w:val="Heading4"/>
-      </w:pPr>
-      <w:r>
-        <w:t>FR-013 Return evaluation to evaluator</w:t>
-      </w:r>
-    </w:p>
-    <w:p>
-      <w:pPr/>
-      <w:r>
-        <w:rPr>
-          <w:b/>
-        </w:rPr>
-        <w:t>Description:</w:t>
-      </w:r>
-      <w:r>
-        <w:t xml:space="preserve"> The system shall allow an approver to return an evaluation to the evaluator with mandatory comments. </w:t>
-      </w:r>
-      <w:r>
-        <w:rPr>
-          <w:b/>
-        </w:rPr>
-        <w:t>Priority:</w:t>
-      </w:r>
-      <w:r>
-        <w:t xml:space="preserve"> Should </w:t>
-      </w:r>
-      <w:r>
-        <w:rPr>
-          <w:b/>
-        </w:rPr>
-        <w:t>Source:</w:t>
-      </w:r>
-      <w:r>
-        <w:t xml:space="preserve"> M-06 (Inferred) </w:t>
-      </w:r>
-      <w:r>
-        <w:rPr>
-          <w:b/>
-        </w:rPr>
-        <w:t>Business rules:</w:t>
-      </w:r>
-      <w:r>
-        <w:t xml:space="preserve"> RULE-08 </w:t>
-      </w:r>
-      <w:r>
-        <w:rPr>
-          <w:b/>
-        </w:rPr>
-        <w:t>Acceptance criteria:</w:t>
-      </w:r>
-    </w:p>
-    <w:p>
-      <w:pPr>
-        <w:pStyle w:val="ListBullet"/>
-      </w:pPr>
-      <w:r>
-        <w:t>AC1: Given an evaluation at any level, when the approver returns it with comments, then the status becomes Returned and it appears in the evaluator's queue with the comments shown.</w:t>
-      </w:r>
-    </w:p>
-    <w:p>
-      <w:pPr>
-        <w:pStyle w:val="ListBullet"/>
-      </w:pPr>
-      <w:r>
-        <w:t>AC2 (negative): Given the approver leaves the comments empty, when they click Return, then the action is refused.</w:t>
-      </w:r>
-    </w:p>
-    <w:p>
-      <w:pPr/>
-      <w:r>
-        <w:rPr>
-          <w:b/>
-        </w:rPr>
-        <w:t>Notes / open questions:</w:t>
-      </w:r>
-      <w:r>
-        <w:t xml:space="preserve"> Q-07 (return vs reject, and where a re-submission restarts).</w:t>
-      </w:r>
-    </w:p>
-    <w:p>
-      <w:pPr>
-        <w:pStyle w:val="Heading4"/>
-      </w:pPr>
-      <w:r>
-        <w:t>FR-014 Prevent self-approval</w:t>
-      </w:r>
-    </w:p>
-    <w:p>
-      <w:pPr/>
-      <w:r>
-        <w:rPr>
-          <w:b/>
-        </w:rPr>
-        <w:t>Description:</w:t>
-      </w:r>
-      <w:r>
-        <w:t xml:space="preserve"> The system shall prevent a user from approving an evaluation in which they are the evaluated employee or the evaluator. </w:t>
-      </w:r>
-      <w:r>
-        <w:rPr>
-          <w:b/>
-        </w:rPr>
-        <w:t>Priority:</w:t>
-      </w:r>
-      <w:r>
-        <w:t xml:space="preserve"> Must </w:t>
-      </w:r>
-      <w:r>
-        <w:rPr>
-          <w:b/>
-        </w:rPr>
-        <w:t>Source:</w:t>
-      </w:r>
-      <w:r>
-        <w:t xml:space="preserve"> M-06 (Inferred) </w:t>
-      </w:r>
-      <w:r>
-        <w:rPr>
-          <w:b/>
-        </w:rPr>
-        <w:t>Business rules:</w:t>
-      </w:r>
-      <w:r>
-        <w:t xml:space="preserve"> RULE-09 </w:t>
-      </w:r>
-      <w:r>
-        <w:rPr>
-          <w:b/>
-        </w:rPr>
-        <w:t>Acceptance criteria:</w:t>
-      </w:r>
-    </w:p>
-    <w:p>
-      <w:pPr>
-        <w:pStyle w:val="ListBullet"/>
-      </w:pPr>
-      <w:r>
-        <w:t>AC1: Given the evaluator is also the resolved Level 1 approver, when the evaluation is submitted, then it moves to the next level and the history records "Skipped: approver is evaluator". If there is no next level, it is placed on the HR exception list (changed in v0.2, RV-06).</w:t>
-      </w:r>
-    </w:p>
-    <w:p>
-      <w:pPr>
-        <w:pStyle w:val="ListBullet"/>
-      </w:pPr>
-      <w:r>
-        <w:t>AC2 (negative): Given the evaluated employee is a resolved approver, when routing runs, then the evaluation is never placed in that employee's queue.</w:t>
-      </w:r>
-    </w:p>
-    <w:p>
-      <w:pPr/>
-      <w:r>
-        <w:rPr>
-          <w:b/>
-        </w:rPr>
-        <w:t>Notes / open questions:</w:t>
-      </w:r>
-      <w:r>
-        <w:t xml:space="preserve"> Q-16.</w:t>
-      </w:r>
-    </w:p>
-    <w:p>
-      <w:pPr>
-        <w:pStyle w:val="Heading2"/>
-      </w:pPr>
-      <w:r>
-        <w:t>3.4 Requirement 4: Automatic routing of the completed evaluation to HR</w:t>
-      </w:r>
-    </w:p>
-    <w:p>
-      <w:pPr/>
-      <w:r>
-        <w:rPr>
-          <w:b/>
-        </w:rPr>
-        <w:t>Description:</w:t>
-      </w:r>
-      <w:r>
-        <w:t xml:space="preserve"> When the last approval level approves, the system shall route the completed evaluation to the HR Department queue automatically. HR shall be able to process it and close it.</w:t>
-      </w:r>
-    </w:p>
-    <w:p>
-      <w:pPr>
-        <w:pStyle w:val="ListBullet"/>
-      </w:pPr>
-      <w:r>
-        <w:t>HR sees the complete evaluation, the recommendation and the full approval trail.</w:t>
-      </w:r>
-    </w:p>
-    <w:p>
-      <w:pPr>
-        <w:pStyle w:val="ListBullet"/>
-      </w:pPr>
-      <w:r>
-        <w:t>HR records the outcome (Confirm / Extend, per HR policy) and closes the evaluation (status Completed).</w:t>
-      </w:r>
-    </w:p>
-    <w:p>
-      <w:pPr>
-        <w:pStyle w:val="ListBullet"/>
-      </w:pPr>
-      <w:r>
-        <w:rPr>
-          <w:b/>
-        </w:rPr>
-        <w:t>Important (from the HRD code):</w:t>
-      </w:r>
-      <w:r>
-        <w:t xml:space="preserve"> the probation record (</w:t>
-      </w:r>
-      <w:r>
-        <w:rPr>
-          <w:rFonts w:ascii="Consolas" w:hAnsi="Consolas"/>
-          <w:sz w:val="18"/>
-        </w:rPr>
-        <w:t>HRD.EMPLOYEE_PROBATION_HISTORY.PROBATION_STATUS</w:t>
-      </w:r>
-      <w:r>
-        <w:t xml:space="preserve">) is set to </w:t>
-      </w:r>
-      <w:r>
-        <w:rPr>
-          <w:b/>
-        </w:rPr>
-        <w:t>Confirmed ('C') only at this HR step</w:t>
-      </w:r>
-      <w:r>
-        <w:t>. Setting 'C' automatically:</w:t>
-      </w:r>
-    </w:p>
-    <w:p>
-      <w:pPr>
-        <w:pStyle w:val="ListBullet2"/>
-      </w:pPr>
-      <w:r>
-        <w:t xml:space="preserve">sets </w:t>
-      </w:r>
-      <w:r>
-        <w:rPr>
-          <w:rFonts w:ascii="Consolas" w:hAnsi="Consolas"/>
-          <w:sz w:val="18"/>
-        </w:rPr>
-        <w:t>HRD.INFORMATION.CONFIRMATION_DATE</w:t>
-      </w:r>
-      <w:r>
-        <w:t>;</w:t>
-      </w:r>
-    </w:p>
-    <w:p>
-      <w:pPr>
-        <w:pStyle w:val="ListBullet2"/>
-      </w:pPr>
-      <w:r>
-        <w:t>creates incentive/allowance queue entries;</w:t>
-      </w:r>
-    </w:p>
-    <w:p>
-      <w:pPr>
-        <w:pStyle w:val="ListBullet2"/>
-      </w:pPr>
-      <w:r>
-        <w:t>clears the HR probation alert.</w:t>
-      </w:r>
-    </w:p>
-    <w:p>
-      <w:pPr>
-        <w:pStyle w:val="ListBullet"/>
-      </w:pPr>
-      <w:r>
-        <w:t xml:space="preserve">An extension updates the probation period instead (reason from </w:t>
-      </w:r>
-      <w:r>
-        <w:rPr>
-          <w:rFonts w:ascii="Consolas" w:hAnsi="Consolas"/>
-          <w:sz w:val="18"/>
-        </w:rPr>
-        <w:t>HRD.PROBATION_REASONS</w:t>
-      </w:r>
-      <w:r>
-        <w:t>).</w:t>
-      </w:r>
-    </w:p>
-    <w:p>
-      <w:pPr>
-        <w:pStyle w:val="ListBullet"/>
-      </w:pPr>
-      <w:r>
-        <w:rPr>
-          <w:b/>
-        </w:rPr>
-        <w:t>To be confirmed with HR:</w:t>
-      </w:r>
-    </w:p>
-    <w:p>
-      <w:pPr>
-        <w:pStyle w:val="ListBullet2"/>
-      </w:pPr>
-      <w:r>
-        <w:t>Does "after submission" mean after final approval (assumed here), or should HR see it as soon as the supervisor submits?</w:t>
-      </w:r>
-    </w:p>
-    <w:p>
-      <w:pPr>
-        <w:pStyle w:val="ListBullet2"/>
-      </w:pPr>
-      <w:r>
-        <w:t>Does this replace the current alert 001 / form S07FRM00362 process?</w:t>
-      </w:r>
-    </w:p>
-    <w:p>
-      <w:pPr/>
-      <w:r>
-        <w:rPr>
-          <w:b/>
-        </w:rPr>
-        <w:t>Acceptance (summary):</w:t>
-      </w:r>
-    </w:p>
-    <w:p>
-      <w:pPr>
-        <w:pStyle w:val="ListBullet"/>
-      </w:pPr>
-      <w:r>
-        <w:t>After the last-level approval, the evaluation appears in the HR queue with status Forwarded to HR.</w:t>
-      </w:r>
-    </w:p>
-    <w:p>
-      <w:pPr>
-        <w:pStyle w:val="ListBullet"/>
-      </w:pPr>
-      <w:r>
-        <w:t>HR cannot process an evaluation that is still pending approval.</w:t>
-      </w:r>
-    </w:p>
-    <w:p>
-      <w:pPr>
-        <w:pStyle w:val="ListBullet"/>
-      </w:pPr>
-      <w:r>
-        <w:t>Confirmation date and incentives change only after HR confirms.</w:t>
-      </w:r>
-    </w:p>
-    <w:p>
-      <w:pPr/>
-      <w:r>
-        <w:rPr>
-          <w:i/>
-        </w:rPr>
-        <w:t>Traceability: FR-015, FR-016, RULE-07, IMP-15, IMP-34.</w:t>
-      </w:r>
-    </w:p>
-    <w:p>
-      <w:pPr>
-        <w:pStyle w:val="Heading3"/>
-      </w:pPr>
-      <w:r>
-        <w:t>3.4.1 Prototype (GUI): HR queue and decision</w:t>
-      </w:r>
-    </w:p>
-    <w:p>
-      <w:pPr/>
-      <w:r>
-        <w:rPr>
-          <w:b/>
-        </w:rPr>
-        <w:t>Screen 5 – HR queue of completed evaluations</w:t>
-      </w:r>
-    </w:p>
-    <w:p>
-      <w:pPr/>
-      <w:r>
         <w:drawing>
           <wp:inline xmlns:a="http://schemas.openxmlformats.org/drawingml/2006/main" xmlns:pic="http://schemas.openxmlformats.org/drawingml/2006/picture">
-            <wp:extent cx="5486400" cy="1654764"/>
+            <wp:extent cx="5486400" cy="1760970"/>
             <wp:docPr id="6" name="Picture 6"/>
             <wp:cNvGraphicFramePr>
               <a:graphicFrameLocks noChangeAspect="1"/>
@@ -5951,7 +5421,7 @@
               <a:graphicData uri="http://schemas.openxmlformats.org/drawingml/2006/picture">
                 <pic:pic>
                   <pic:nvPicPr>
-                    <pic:cNvPr id="0" name="05_hr_queue.png"/>
+                    <pic:cNvPr id="0" name="05_hierarchy_setup.png"/>
                     <pic:cNvPicPr/>
                   </pic:nvPicPr>
                   <pic:blipFill>
@@ -5963,7 +5433,7 @@
                   <pic:spPr>
                     <a:xfrm>
                       <a:off x="0" y="0"/>
-                      <a:ext cx="5486400" cy="1654764"/>
+                      <a:ext cx="5486400" cy="1760970"/>
                     </a:xfrm>
                     <a:prstGeom prst="rect"/>
                   </pic:spPr>
@@ -5975,20 +5445,550 @@
       </w:r>
     </w:p>
     <w:p>
+      <w:pPr>
+        <w:pStyle w:val="Heading3"/>
+      </w:pPr>
+      <w:r>
+        <w:t>3.3.2 Detailed functional requirements</w:t>
+      </w:r>
+    </w:p>
+    <w:p>
+      <w:pPr>
+        <w:pStyle w:val="Heading4"/>
+      </w:pPr>
+      <w:r>
+        <w:t>FR-011 Route to configured approval hierarchy</w:t>
+      </w:r>
+    </w:p>
+    <w:p>
       <w:pPr/>
       <w:r>
         <w:rPr>
           <w:b/>
         </w:rPr>
-        <w:t>Screen 6 – HR Decision (Confirm / Extend)</w:t>
+        <w:t>Description:</w:t>
+      </w:r>
+      <w:r>
+        <w:t xml:space="preserve"> The system shall route a submitted evaluation to the first level of the approval hierarchy configured for probation evaluations, resolving the approver for that level from the evaluated employee's department as on the submission date (changed in v0.2, RV-12; pending Q-16). </w:t>
+      </w:r>
+      <w:r>
+        <w:rPr>
+          <w:b/>
+        </w:rPr>
+        <w:t>Priority:</w:t>
+      </w:r>
+      <w:r>
+        <w:t xml:space="preserve"> Must </w:t>
+      </w:r>
+      <w:r>
+        <w:rPr>
+          <w:b/>
+        </w:rPr>
+        <w:t>Source:</w:t>
+      </w:r>
+      <w:r>
+        <w:t xml:space="preserve"> M-06 </w:t>
+      </w:r>
+      <w:r>
+        <w:rPr>
+          <w:b/>
+        </w:rPr>
+        <w:t>Business rules:</w:t>
+      </w:r>
+      <w:r>
+        <w:t xml:space="preserve"> RULE-06, RULE-09 </w:t>
+      </w:r>
+      <w:r>
+        <w:rPr>
+          <w:b/>
+        </w:rPr>
+        <w:t>Acceptance criteria:</w:t>
+      </w:r>
+    </w:p>
+    <w:p>
+      <w:pPr>
+        <w:pStyle w:val="ListBullet"/>
+      </w:pPr>
+      <w:r>
+        <w:t>AC1: Given a configured hierarchy of Level 1 = HOD and Level 2 = Director, when an evaluation for an employee in Department D-TEST is submitted, then it appears in the D-TEST HOD's approval queue and the status shows Pending Approval – Level 1.</w:t>
+      </w:r>
+    </w:p>
+    <w:p>
+      <w:pPr>
+        <w:pStyle w:val="ListBullet"/>
+      </w:pPr>
+      <w:r>
+        <w:t>AC2 (negative): Given a hierarchy level whose approver cannot be resolved, when the evaluation reaches that level, then it is placed on the HR exception list with the reason "Approver not defined for level n" and is not lost.</w:t>
       </w:r>
     </w:p>
     <w:p>
       <w:pPr/>
       <w:r>
+        <w:rPr>
+          <w:b/>
+        </w:rPr>
+        <w:t>Notes / open questions:</w:t>
+      </w:r>
+      <w:r>
+        <w:t xml:space="preserve"> Q-15 (is there an existing approval hierarchy setup), Q-16 (hierarchy basis).</w:t>
+      </w:r>
+    </w:p>
+    <w:p>
+      <w:pPr>
+        <w:pStyle w:val="Heading4"/>
+      </w:pPr>
+      <w:r>
+        <w:t>FR-012 Approve at a level</w:t>
+      </w:r>
+    </w:p>
+    <w:p>
+      <w:pPr/>
+      <w:r>
+        <w:rPr>
+          <w:b/>
+        </w:rPr>
+        <w:t>Description:</w:t>
+      </w:r>
+      <w:r>
+        <w:t xml:space="preserve"> The system shall allow the approver at the current level to approve the evaluation, with optional comments, and move it to the next configured level. </w:t>
+      </w:r>
+      <w:r>
+        <w:rPr>
+          <w:b/>
+        </w:rPr>
+        <w:t>Priority:</w:t>
+      </w:r>
+      <w:r>
+        <w:t xml:space="preserve"> Must </w:t>
+      </w:r>
+      <w:r>
+        <w:rPr>
+          <w:b/>
+        </w:rPr>
+        <w:t>Source:</w:t>
+      </w:r>
+      <w:r>
+        <w:t xml:space="preserve"> M-06 </w:t>
+      </w:r>
+      <w:r>
+        <w:rPr>
+          <w:b/>
+        </w:rPr>
+        <w:t>Business rules:</w:t>
+      </w:r>
+      <w:r>
+        <w:t xml:space="preserve"> RULE-06 </w:t>
+      </w:r>
+      <w:r>
+        <w:rPr>
+          <w:b/>
+        </w:rPr>
+        <w:t>Acceptance criteria:</w:t>
+      </w:r>
+    </w:p>
+    <w:p>
+      <w:pPr>
+        <w:pStyle w:val="ListBullet"/>
+      </w:pPr>
+      <w:r>
+        <w:t>AC1: Given an evaluation at Level 1 of a 2-level hierarchy, when the Level 1 approver approves, then it moves to the Level 2 approver's queue and leaves the Level 1 queue.</w:t>
+      </w:r>
+    </w:p>
+    <w:p>
+      <w:pPr>
+        <w:pStyle w:val="ListBullet"/>
+      </w:pPr>
+      <w:r>
+        <w:t>AC2 (negative): Given an evaluation at Level 2, when the Level 1 approver tries to approve it again, then the action is not available.</w:t>
+      </w:r>
+    </w:p>
+    <w:p>
+      <w:pPr/>
+      <w:r>
+        <w:rPr>
+          <w:b/>
+        </w:rPr>
+        <w:t>Notes / open questions:</w:t>
+      </w:r>
+      <w:r>
+        <w:t xml:space="preserve"> -</w:t>
+      </w:r>
+    </w:p>
+    <w:p>
+      <w:pPr>
+        <w:pStyle w:val="Heading4"/>
+      </w:pPr>
+      <w:r>
+        <w:t>FR-013 Return evaluation to evaluator</w:t>
+      </w:r>
+    </w:p>
+    <w:p>
+      <w:pPr/>
+      <w:r>
+        <w:rPr>
+          <w:b/>
+        </w:rPr>
+        <w:t>Description:</w:t>
+      </w:r>
+      <w:r>
+        <w:t xml:space="preserve"> The system shall allow an approver to return an evaluation to the evaluator with mandatory comments. </w:t>
+      </w:r>
+      <w:r>
+        <w:rPr>
+          <w:b/>
+        </w:rPr>
+        <w:t>Priority:</w:t>
+      </w:r>
+      <w:r>
+        <w:t xml:space="preserve"> Should </w:t>
+      </w:r>
+      <w:r>
+        <w:rPr>
+          <w:b/>
+        </w:rPr>
+        <w:t>Source:</w:t>
+      </w:r>
+      <w:r>
+        <w:t xml:space="preserve"> M-06 (Inferred) </w:t>
+      </w:r>
+      <w:r>
+        <w:rPr>
+          <w:b/>
+        </w:rPr>
+        <w:t>Business rules:</w:t>
+      </w:r>
+      <w:r>
+        <w:t xml:space="preserve"> RULE-08 </w:t>
+      </w:r>
+      <w:r>
+        <w:rPr>
+          <w:b/>
+        </w:rPr>
+        <w:t>Acceptance criteria:</w:t>
+      </w:r>
+    </w:p>
+    <w:p>
+      <w:pPr>
+        <w:pStyle w:val="ListBullet"/>
+      </w:pPr>
+      <w:r>
+        <w:t>AC1: Given an evaluation at any level, when the approver returns it with comments, then the status becomes Returned and it appears in the evaluator's queue with the comments shown.</w:t>
+      </w:r>
+    </w:p>
+    <w:p>
+      <w:pPr>
+        <w:pStyle w:val="ListBullet"/>
+      </w:pPr>
+      <w:r>
+        <w:t>AC2 (negative): Given the approver leaves the comments empty, when they click Return, then the action is refused.</w:t>
+      </w:r>
+    </w:p>
+    <w:p>
+      <w:pPr/>
+      <w:r>
+        <w:rPr>
+          <w:b/>
+        </w:rPr>
+        <w:t>Notes / open questions:</w:t>
+      </w:r>
+      <w:r>
+        <w:t xml:space="preserve"> Q-07 (return vs reject, and where a re-submission restarts).</w:t>
+      </w:r>
+    </w:p>
+    <w:p>
+      <w:pPr>
+        <w:pStyle w:val="Heading4"/>
+      </w:pPr>
+      <w:r>
+        <w:t>FR-014 Prevent self-approval</w:t>
+      </w:r>
+    </w:p>
+    <w:p>
+      <w:pPr/>
+      <w:r>
+        <w:rPr>
+          <w:b/>
+        </w:rPr>
+        <w:t>Description:</w:t>
+      </w:r>
+      <w:r>
+        <w:t xml:space="preserve"> The system shall prevent a user from approving an evaluation in which they are the evaluated employee or the evaluator. </w:t>
+      </w:r>
+      <w:r>
+        <w:rPr>
+          <w:b/>
+        </w:rPr>
+        <w:t>Priority:</w:t>
+      </w:r>
+      <w:r>
+        <w:t xml:space="preserve"> Must </w:t>
+      </w:r>
+      <w:r>
+        <w:rPr>
+          <w:b/>
+        </w:rPr>
+        <w:t>Source:</w:t>
+      </w:r>
+      <w:r>
+        <w:t xml:space="preserve"> M-06 (Inferred) </w:t>
+      </w:r>
+      <w:r>
+        <w:rPr>
+          <w:b/>
+        </w:rPr>
+        <w:t>Business rules:</w:t>
+      </w:r>
+      <w:r>
+        <w:t xml:space="preserve"> RULE-09 </w:t>
+      </w:r>
+      <w:r>
+        <w:rPr>
+          <w:b/>
+        </w:rPr>
+        <w:t>Acceptance criteria:</w:t>
+      </w:r>
+    </w:p>
+    <w:p>
+      <w:pPr>
+        <w:pStyle w:val="ListBullet"/>
+      </w:pPr>
+      <w:r>
+        <w:t>AC1: Given the evaluator is also the resolved Level 1 approver, when the evaluation is submitted, then it moves to the next level and the history records "Skipped: approver is evaluator". If there is no next level, it is placed on the HR exception list (changed in v0.2, RV-06).</w:t>
+      </w:r>
+    </w:p>
+    <w:p>
+      <w:pPr>
+        <w:pStyle w:val="ListBullet"/>
+      </w:pPr>
+      <w:r>
+        <w:t>AC2 (negative): Given the evaluated employee is a resolved approver, when routing runs, then the evaluation is never placed in that employee's queue.</w:t>
+      </w:r>
+    </w:p>
+    <w:p>
+      <w:pPr/>
+      <w:r>
+        <w:rPr>
+          <w:b/>
+        </w:rPr>
+        <w:t>Notes / open questions:</w:t>
+      </w:r>
+      <w:r>
+        <w:t xml:space="preserve"> Q-16.</w:t>
+      </w:r>
+    </w:p>
+    <w:p>
+      <w:pPr>
+        <w:pStyle w:val="Heading2"/>
+      </w:pPr>
+      <w:r>
+        <w:t>3.4 Requirement 4: Automatic routing of the completed evaluation to HR</w:t>
+      </w:r>
+    </w:p>
+    <w:p>
+      <w:pPr/>
+      <w:r>
+        <w:rPr>
+          <w:b/>
+        </w:rPr>
+        <w:t>Description:</w:t>
+      </w:r>
+      <w:r>
+        <w:t xml:space="preserve"> When the last approval level approves, the system shall route the completed evaluation to the HR Department queue automatically. HR shall be able to process it and close it.</w:t>
+      </w:r>
+    </w:p>
+    <w:p>
+      <w:pPr>
+        <w:pStyle w:val="ListBullet"/>
+      </w:pPr>
+      <w:r>
+        <w:t>HR sees the complete evaluation, the recommendation and the full approval trail.</w:t>
+      </w:r>
+    </w:p>
+    <w:p>
+      <w:pPr>
+        <w:pStyle w:val="ListBullet"/>
+      </w:pPr>
+      <w:r>
+        <w:t>HR records the outcome (Confirm / Extend, per HR policy) and closes the evaluation (status Completed).</w:t>
+      </w:r>
+    </w:p>
+    <w:p>
+      <w:pPr>
+        <w:pStyle w:val="ListBullet"/>
+      </w:pPr>
+      <w:r>
+        <w:rPr>
+          <w:b/>
+        </w:rPr>
+        <w:t>Important (from the HRD code):</w:t>
+      </w:r>
+      <w:r>
+        <w:t xml:space="preserve"> the probation record (</w:t>
+      </w:r>
+      <w:r>
+        <w:rPr>
+          <w:rFonts w:ascii="Consolas" w:hAnsi="Consolas"/>
+          <w:sz w:val="18"/>
+        </w:rPr>
+        <w:t>HRD.EMPLOYEE_PROBATION_HISTORY.PROBATION_STATUS</w:t>
+      </w:r>
+      <w:r>
+        <w:t xml:space="preserve">) is set to </w:t>
+      </w:r>
+      <w:r>
+        <w:rPr>
+          <w:b/>
+        </w:rPr>
+        <w:t>Confirmed ('C') only at this HR step</w:t>
+      </w:r>
+      <w:r>
+        <w:t>. Setting 'C' automatically:</w:t>
+      </w:r>
+    </w:p>
+    <w:p>
+      <w:pPr>
+        <w:pStyle w:val="ListBullet2"/>
+      </w:pPr>
+      <w:r>
+        <w:t xml:space="preserve">sets </w:t>
+      </w:r>
+      <w:r>
+        <w:rPr>
+          <w:rFonts w:ascii="Consolas" w:hAnsi="Consolas"/>
+          <w:sz w:val="18"/>
+        </w:rPr>
+        <w:t>HRD.INFORMATION.CONFIRMATION_DATE</w:t>
+      </w:r>
+      <w:r>
+        <w:t>;</w:t>
+      </w:r>
+    </w:p>
+    <w:p>
+      <w:pPr>
+        <w:pStyle w:val="ListBullet2"/>
+      </w:pPr>
+      <w:r>
+        <w:t>creates incentive/allowance queue entries;</w:t>
+      </w:r>
+    </w:p>
+    <w:p>
+      <w:pPr>
+        <w:pStyle w:val="ListBullet2"/>
+      </w:pPr>
+      <w:r>
+        <w:t>clears the HR probation alert.</w:t>
+      </w:r>
+    </w:p>
+    <w:p>
+      <w:pPr>
+        <w:pStyle w:val="ListBullet"/>
+      </w:pPr>
+      <w:r>
+        <w:t xml:space="preserve">An extension updates the probation period instead (reason from </w:t>
+      </w:r>
+      <w:r>
+        <w:rPr>
+          <w:rFonts w:ascii="Consolas" w:hAnsi="Consolas"/>
+          <w:sz w:val="18"/>
+        </w:rPr>
+        <w:t>HRD.PROBATION_REASONS</w:t>
+      </w:r>
+      <w:r>
+        <w:t>).</w:t>
+      </w:r>
+    </w:p>
+    <w:p>
+      <w:pPr>
+        <w:pStyle w:val="ListBullet"/>
+      </w:pPr>
+      <w:r>
+        <w:rPr>
+          <w:b/>
+        </w:rPr>
+        <w:t>To be confirmed with HR:</w:t>
+      </w:r>
+    </w:p>
+    <w:p>
+      <w:pPr>
+        <w:pStyle w:val="ListBullet2"/>
+      </w:pPr>
+      <w:r>
+        <w:t>Does "after submission" mean after final approval (assumed here), or should HR see it as soon as the supervisor submits?</w:t>
+      </w:r>
+    </w:p>
+    <w:p>
+      <w:pPr>
+        <w:pStyle w:val="ListBullet2"/>
+      </w:pPr>
+      <w:r>
+        <w:t>Does this replace the current alert 001 / form S07FRM00362 process?</w:t>
+      </w:r>
+    </w:p>
+    <w:p>
+      <w:pPr/>
+      <w:r>
+        <w:rPr>
+          <w:b/>
+        </w:rPr>
+        <w:t>Acceptance (summary):</w:t>
+      </w:r>
+    </w:p>
+    <w:p>
+      <w:pPr>
+        <w:pStyle w:val="ListBullet"/>
+      </w:pPr>
+      <w:r>
+        <w:t>After the last-level approval, the evaluation appears in the HR queue with status Forwarded to HR.</w:t>
+      </w:r>
+    </w:p>
+    <w:p>
+      <w:pPr>
+        <w:pStyle w:val="ListBullet"/>
+      </w:pPr>
+      <w:r>
+        <w:t>HR cannot process an evaluation that is still pending approval.</w:t>
+      </w:r>
+    </w:p>
+    <w:p>
+      <w:pPr>
+        <w:pStyle w:val="ListBullet"/>
+      </w:pPr>
+      <w:r>
+        <w:t>Confirmation date and incentives change only after HR confirms.</w:t>
+      </w:r>
+    </w:p>
+    <w:p>
+      <w:pPr/>
+      <w:r>
+        <w:rPr>
+          <w:i/>
+        </w:rPr>
+        <w:t>Traceability: FR-015, FR-016, RULE-07, IMP-15, IMP-34.</w:t>
+      </w:r>
+    </w:p>
+    <w:p>
+      <w:pPr>
+        <w:pStyle w:val="Heading3"/>
+      </w:pPr>
+      <w:r>
+        <w:t>3.4.1 Prototype (GUI): HR queue and decision</w:t>
+      </w:r>
+    </w:p>
+    <w:p>
+      <w:pPr/>
+      <w:r>
+        <w:rPr>
+          <w:b/>
+        </w:rPr>
+        <w:t>Screen 6 – HR queue of completed evaluations</w:t>
+      </w:r>
+    </w:p>
+    <w:p>
+      <w:pPr/>
+      <w:r>
         <w:drawing>
           <wp:inline xmlns:a="http://schemas.openxmlformats.org/drawingml/2006/main" xmlns:pic="http://schemas.openxmlformats.org/drawingml/2006/picture">
-            <wp:extent cx="5486400" cy="4031349"/>
+            <wp:extent cx="5486400" cy="1017449"/>
             <wp:docPr id="7" name="Picture 7"/>
             <wp:cNvGraphicFramePr>
               <a:graphicFrameLocks noChangeAspect="1"/>
@@ -5997,7 +5997,7 @@
               <a:graphicData uri="http://schemas.openxmlformats.org/drawingml/2006/picture">
                 <pic:pic>
                   <pic:nvPicPr>
-                    <pic:cNvPr id="0" name="06_hr_decision.png"/>
+                    <pic:cNvPr id="0" name="06_hr_queue.png"/>
                     <pic:cNvPicPr/>
                   </pic:nvPicPr>
                   <pic:blipFill>
@@ -6009,7 +6009,7 @@
                   <pic:spPr>
                     <a:xfrm>
                       <a:off x="0" y="0"/>
-                      <a:ext cx="5486400" cy="4031349"/>
+                      <a:ext cx="5486400" cy="1017449"/>
                     </a:xfrm>
                     <a:prstGeom prst="rect"/>
                   </pic:spPr>
@@ -6021,310 +6021,20 @@
       </w:r>
     </w:p>
     <w:p>
-      <w:pPr>
-        <w:pStyle w:val="Heading3"/>
-      </w:pPr>
-      <w:r>
-        <w:t>3.4.2 Detailed functional requirements</w:t>
-      </w:r>
-    </w:p>
-    <w:p>
-      <w:pPr>
-        <w:pStyle w:val="Heading4"/>
-      </w:pPr>
-      <w:r>
-        <w:t>FR-015 Forward completed evaluation to HR</w:t>
+      <w:pPr/>
+      <w:r>
+        <w:rPr>
+          <w:b/>
+        </w:rPr>
+        <w:t>Screen 7 – HR Finalization (Confirm / Extend)</w:t>
       </w:r>
     </w:p>
     <w:p>
       <w:pPr/>
       <w:r>
-        <w:rPr>
-          <w:b/>
-        </w:rPr>
-        <w:t>Description:</w:t>
-      </w:r>
-      <w:r>
-        <w:t xml:space="preserve"> The system shall automatically route the evaluation to the HR Department queue when the last level of the approval hierarchy approves it. </w:t>
-      </w:r>
-      <w:r>
-        <w:rPr>
-          <w:b/>
-        </w:rPr>
-        <w:t>Priority:</w:t>
-      </w:r>
-      <w:r>
-        <w:t xml:space="preserve"> Must </w:t>
-      </w:r>
-      <w:r>
-        <w:rPr>
-          <w:b/>
-        </w:rPr>
-        <w:t>Source:</w:t>
-      </w:r>
-      <w:r>
-        <w:t xml:space="preserve"> M-07 </w:t>
-      </w:r>
-      <w:r>
-        <w:rPr>
-          <w:b/>
-        </w:rPr>
-        <w:t>Business rules:</w:t>
-      </w:r>
-      <w:r>
-        <w:t xml:space="preserve"> RULE-07 </w:t>
-      </w:r>
-      <w:r>
-        <w:rPr>
-          <w:b/>
-        </w:rPr>
-        <w:t>Acceptance criteria:</w:t>
-      </w:r>
-    </w:p>
-    <w:p>
-      <w:pPr>
-        <w:pStyle w:val="ListBullet"/>
-      </w:pPr>
-      <w:r>
-        <w:t>AC1: Given an evaluation at the last configured level, when that approver approves, then the evaluation appears in the HR Department queue and the status becomes Forwarded to HR.</w:t>
-      </w:r>
-    </w:p>
-    <w:p>
-      <w:pPr>
-        <w:pStyle w:val="ListBullet"/>
-      </w:pPr>
-      <w:r>
-        <w:t>AC2 (negative): Given an evaluation still at an intermediate level, when HR views its queue, then the evaluation is not in HR's actionable queue (only on the monitoring view, FR-017).</w:t>
-      </w:r>
-    </w:p>
-    <w:p>
-      <w:pPr/>
-      <w:r>
-        <w:rPr>
-          <w:b/>
-        </w:rPr>
-        <w:t>Notes / open questions:</w:t>
-      </w:r>
-      <w:r>
-        <w:t xml:space="preserve"> Q-06, Q-17 ("after submission" timing).</w:t>
-      </w:r>
-    </w:p>
-    <w:p>
-      <w:pPr>
-        <w:pStyle w:val="Heading4"/>
-      </w:pPr>
-      <w:r>
-        <w:t>FR-016 HR closes evaluation</w:t>
-      </w:r>
-    </w:p>
-    <w:p>
-      <w:pPr/>
-      <w:r>
-        <w:rPr>
-          <w:b/>
-        </w:rPr>
-        <w:t>Description:</w:t>
-      </w:r>
-      <w:r>
-        <w:t xml:space="preserve"> The system shall allow an HR user to mark a forwarded evaluation as processed, which completes the evaluation. </w:t>
-      </w:r>
-      <w:r>
-        <w:rPr>
-          <w:b/>
-        </w:rPr>
-        <w:t>Priority:</w:t>
-      </w:r>
-      <w:r>
-        <w:t xml:space="preserve"> Must </w:t>
-      </w:r>
-      <w:r>
-        <w:rPr>
-          <w:b/>
-        </w:rPr>
-        <w:t>Source:</w:t>
-      </w:r>
-      <w:r>
-        <w:t xml:space="preserve"> M-07, M-08 </w:t>
-      </w:r>
-      <w:r>
-        <w:rPr>
-          <w:b/>
-        </w:rPr>
-        <w:t>Business rules:</w:t>
-      </w:r>
-      <w:r>
-        <w:t xml:space="preserve"> RULE-08 </w:t>
-      </w:r>
-      <w:r>
-        <w:rPr>
-          <w:b/>
-        </w:rPr>
-        <w:t>Acceptance criteria:</w:t>
-      </w:r>
-    </w:p>
-    <w:p>
-      <w:pPr>
-        <w:pStyle w:val="ListBullet"/>
-      </w:pPr>
-      <w:r>
-        <w:t>AC1: Given an evaluation Forwarded to HR, when an HR user marks it as processed, then the status becomes Completed and it leaves the HR queue.</w:t>
-      </w:r>
-    </w:p>
-    <w:p>
-      <w:pPr>
-        <w:pStyle w:val="ListBullet"/>
-      </w:pPr>
-      <w:r>
-        <w:t>AC2 (negative): Given an evaluation in Pending Approval, when an HR user tries to mark it processed, then the action is not available.</w:t>
-      </w:r>
-    </w:p>
-    <w:p>
-      <w:pPr/>
-      <w:r>
-        <w:rPr>
-          <w:b/>
-        </w:rPr>
-        <w:t>Notes / open questions:</w:t>
-      </w:r>
-      <w:r>
-        <w:t xml:space="preserve"> Q-06 (HR actions and outcome values).</w:t>
-      </w:r>
-    </w:p>
-    <w:p>
-      <w:pPr>
-        <w:pStyle w:val="Heading2"/>
-      </w:pPr>
-      <w:r>
-        <w:t>3.5 Requirement 5: Automatic status update throughout the workflow</w:t>
-      </w:r>
-    </w:p>
-    <w:p>
-      <w:pPr/>
-      <w:r>
-        <w:rPr>
-          <w:b/>
-        </w:rPr>
-        <w:t>Description:</w:t>
-      </w:r>
-      <w:r>
-        <w:t xml:space="preserve"> The system shall update the evaluation / probation request status automatically at every workflow event. Users cannot edit the status by hand. Every change is kept in an insert-only history.</w:t>
-      </w:r>
-    </w:p>
-    <w:p>
-      <w:pPr>
-        <w:pStyle w:val="ListBullet"/>
-      </w:pPr>
-      <w:r>
-        <w:t>Status values (proposed): Evaluation Pending → Draft → Pending Approval – Level n → Returned → Forwarded to HR → Completed, plus Cancelled.</w:t>
-      </w:r>
-    </w:p>
-    <w:p>
-      <w:pPr>
-        <w:pStyle w:val="ListBullet"/>
-      </w:pPr>
-      <w:r>
-        <w:t>History records the old status, new status, action, comments, user and date-time.</w:t>
-      </w:r>
-    </w:p>
-    <w:p>
-      <w:pPr>
-        <w:pStyle w:val="ListBullet"/>
-      </w:pPr>
-      <w:r>
-        <w:t xml:space="preserve">HR has a </w:t>
-      </w:r>
-      <w:r>
-        <w:rPr>
-          <w:b/>
-        </w:rPr>
-        <w:t>monitoring screen</w:t>
-      </w:r>
-      <w:r>
-        <w:t xml:space="preserve"> of all evaluations, with filters by status, department, evaluator and end date. It flags evaluations as </w:t>
-      </w:r>
-      <w:r>
-        <w:rPr>
-          <w:b/>
-        </w:rPr>
-        <w:t>overdue</w:t>
-      </w:r>
-      <w:r>
-        <w:t xml:space="preserve"> when they are not with HR by the probation end date.</w:t>
-      </w:r>
-    </w:p>
-    <w:p>
-      <w:pPr>
-        <w:pStyle w:val="ListBullet"/>
-      </w:pPr>
-      <w:r>
-        <w:t>Supervisors and approvers see the status of their own items.</w:t>
-      </w:r>
-    </w:p>
-    <w:p>
-      <w:pPr/>
-      <w:r>
-        <w:rPr>
-          <w:b/>
-        </w:rPr>
-        <w:t>Acceptance (summary):</w:t>
-      </w:r>
-    </w:p>
-    <w:p>
-      <w:pPr>
-        <w:pStyle w:val="ListBullet"/>
-      </w:pPr>
-      <w:r>
-        <w:t>Submitting a Draft changes the status to Pending Approval – Level 1 with no manual step.</w:t>
-      </w:r>
-    </w:p>
-    <w:p>
-      <w:pPr>
-        <w:pStyle w:val="ListBullet"/>
-      </w:pPr>
-      <w:r>
-        <w:t>The history shows each step in time order.</w:t>
-      </w:r>
-    </w:p>
-    <w:p>
-      <w:pPr>
-        <w:pStyle w:val="ListBullet"/>
-      </w:pPr>
-      <w:r>
-        <w:t>No user can edit or delete history.</w:t>
-      </w:r>
-    </w:p>
-    <w:p>
-      <w:pPr/>
-      <w:r>
-        <w:rPr>
-          <w:i/>
-        </w:rPr>
-        <w:t>Traceability: FR-017 – FR-020, RULE-08, RULE-10, NFR-AUD-01/02.</w:t>
-      </w:r>
-    </w:p>
-    <w:p>
-      <w:pPr>
-        <w:pStyle w:val="Heading3"/>
-      </w:pPr>
-      <w:r>
-        <w:t>3.5.1 Prototype (GUI): Monitoring and status history</w:t>
-      </w:r>
-    </w:p>
-    <w:p>
-      <w:pPr/>
-      <w:r>
-        <w:rPr>
-          <w:b/>
-        </w:rPr>
-        <w:t>Screen 7 – Probation Evaluation Monitoring with status history (HR)</w:t>
-      </w:r>
-    </w:p>
-    <w:p>
-      <w:pPr/>
-      <w:r>
         <w:drawing>
           <wp:inline xmlns:a="http://schemas.openxmlformats.org/drawingml/2006/main" xmlns:pic="http://schemas.openxmlformats.org/drawingml/2006/picture">
-            <wp:extent cx="5486400" cy="3366590"/>
+            <wp:extent cx="5486400" cy="2640151"/>
             <wp:docPr id="8" name="Picture 8"/>
             <wp:cNvGraphicFramePr>
               <a:graphicFrameLocks noChangeAspect="1"/>
@@ -6333,7 +6043,7 @@
               <a:graphicData uri="http://schemas.openxmlformats.org/drawingml/2006/picture">
                 <pic:pic>
                   <pic:nvPicPr>
-                    <pic:cNvPr id="0" name="07_monitoring.png"/>
+                    <pic:cNvPr id="0" name="07_hr_decision.png"/>
                     <pic:cNvPicPr/>
                   </pic:nvPicPr>
                   <pic:blipFill>
@@ -6345,7 +6055,343 @@
                   <pic:spPr>
                     <a:xfrm>
                       <a:off x="0" y="0"/>
-                      <a:ext cx="5486400" cy="3366590"/>
+                      <a:ext cx="5486400" cy="2640151"/>
+                    </a:xfrm>
+                    <a:prstGeom prst="rect"/>
+                  </pic:spPr>
+                </pic:pic>
+              </a:graphicData>
+            </a:graphic>
+          </wp:inline>
+        </w:drawing>
+      </w:r>
+    </w:p>
+    <w:p>
+      <w:pPr>
+        <w:pStyle w:val="Heading3"/>
+      </w:pPr>
+      <w:r>
+        <w:t>3.4.2 Detailed functional requirements</w:t>
+      </w:r>
+    </w:p>
+    <w:p>
+      <w:pPr>
+        <w:pStyle w:val="Heading4"/>
+      </w:pPr>
+      <w:r>
+        <w:t>FR-015 Forward completed evaluation to HR</w:t>
+      </w:r>
+    </w:p>
+    <w:p>
+      <w:pPr/>
+      <w:r>
+        <w:rPr>
+          <w:b/>
+        </w:rPr>
+        <w:t>Description:</w:t>
+      </w:r>
+      <w:r>
+        <w:t xml:space="preserve"> The system shall automatically route the evaluation to the HR Department queue when the last level of the approval hierarchy approves it. </w:t>
+      </w:r>
+      <w:r>
+        <w:rPr>
+          <w:b/>
+        </w:rPr>
+        <w:t>Priority:</w:t>
+      </w:r>
+      <w:r>
+        <w:t xml:space="preserve"> Must </w:t>
+      </w:r>
+      <w:r>
+        <w:rPr>
+          <w:b/>
+        </w:rPr>
+        <w:t>Source:</w:t>
+      </w:r>
+      <w:r>
+        <w:t xml:space="preserve"> M-07 </w:t>
+      </w:r>
+      <w:r>
+        <w:rPr>
+          <w:b/>
+        </w:rPr>
+        <w:t>Business rules:</w:t>
+      </w:r>
+      <w:r>
+        <w:t xml:space="preserve"> RULE-07 </w:t>
+      </w:r>
+      <w:r>
+        <w:rPr>
+          <w:b/>
+        </w:rPr>
+        <w:t>Acceptance criteria:</w:t>
+      </w:r>
+    </w:p>
+    <w:p>
+      <w:pPr>
+        <w:pStyle w:val="ListBullet"/>
+      </w:pPr>
+      <w:r>
+        <w:t>AC1: Given an evaluation at the last configured level, when that approver approves, then the evaluation appears in the HR Department queue and the status becomes Forwarded to HR.</w:t>
+      </w:r>
+    </w:p>
+    <w:p>
+      <w:pPr>
+        <w:pStyle w:val="ListBullet"/>
+      </w:pPr>
+      <w:r>
+        <w:t>AC2 (negative): Given an evaluation still at an intermediate level, when HR views its queue, then the evaluation is not in HR's actionable queue (only on the monitoring view, FR-017).</w:t>
+      </w:r>
+    </w:p>
+    <w:p>
+      <w:pPr/>
+      <w:r>
+        <w:rPr>
+          <w:b/>
+        </w:rPr>
+        <w:t>Notes / open questions:</w:t>
+      </w:r>
+      <w:r>
+        <w:t xml:space="preserve"> Q-06, Q-17 ("after submission" timing).</w:t>
+      </w:r>
+    </w:p>
+    <w:p>
+      <w:pPr>
+        <w:pStyle w:val="Heading4"/>
+      </w:pPr>
+      <w:r>
+        <w:t>FR-016 HR closes evaluation</w:t>
+      </w:r>
+    </w:p>
+    <w:p>
+      <w:pPr/>
+      <w:r>
+        <w:rPr>
+          <w:b/>
+        </w:rPr>
+        <w:t>Description:</w:t>
+      </w:r>
+      <w:r>
+        <w:t xml:space="preserve"> The system shall allow an HR user to mark a forwarded evaluation as processed, which completes the evaluation. </w:t>
+      </w:r>
+      <w:r>
+        <w:rPr>
+          <w:b/>
+        </w:rPr>
+        <w:t>Priority:</w:t>
+      </w:r>
+      <w:r>
+        <w:t xml:space="preserve"> Must </w:t>
+      </w:r>
+      <w:r>
+        <w:rPr>
+          <w:b/>
+        </w:rPr>
+        <w:t>Source:</w:t>
+      </w:r>
+      <w:r>
+        <w:t xml:space="preserve"> M-07, M-08 </w:t>
+      </w:r>
+      <w:r>
+        <w:rPr>
+          <w:b/>
+        </w:rPr>
+        <w:t>Business rules:</w:t>
+      </w:r>
+      <w:r>
+        <w:t xml:space="preserve"> RULE-08 </w:t>
+      </w:r>
+      <w:r>
+        <w:rPr>
+          <w:b/>
+        </w:rPr>
+        <w:t>Acceptance criteria:</w:t>
+      </w:r>
+    </w:p>
+    <w:p>
+      <w:pPr>
+        <w:pStyle w:val="ListBullet"/>
+      </w:pPr>
+      <w:r>
+        <w:t>AC1: Given an evaluation Forwarded to HR, when an HR user marks it as processed, then the status becomes Completed and it leaves the HR queue.</w:t>
+      </w:r>
+    </w:p>
+    <w:p>
+      <w:pPr>
+        <w:pStyle w:val="ListBullet"/>
+      </w:pPr>
+      <w:r>
+        <w:t>AC2 (negative): Given an evaluation in Pending Approval, when an HR user tries to mark it processed, then the action is not available.</w:t>
+      </w:r>
+    </w:p>
+    <w:p>
+      <w:pPr/>
+      <w:r>
+        <w:rPr>
+          <w:b/>
+        </w:rPr>
+        <w:t>Notes / open questions:</w:t>
+      </w:r>
+      <w:r>
+        <w:t xml:space="preserve"> Q-06 (HR actions and outcome values).</w:t>
+      </w:r>
+    </w:p>
+    <w:p>
+      <w:pPr>
+        <w:pStyle w:val="Heading2"/>
+      </w:pPr>
+      <w:r>
+        <w:t>3.5 Requirement 5: Automatic status update throughout the workflow</w:t>
+      </w:r>
+    </w:p>
+    <w:p>
+      <w:pPr/>
+      <w:r>
+        <w:rPr>
+          <w:b/>
+        </w:rPr>
+        <w:t>Description:</w:t>
+      </w:r>
+      <w:r>
+        <w:t xml:space="preserve"> The system shall update the evaluation / probation request status automatically at every workflow event. Users cannot edit the status by hand. Every change is kept in an insert-only history.</w:t>
+      </w:r>
+    </w:p>
+    <w:p>
+      <w:pPr>
+        <w:pStyle w:val="ListBullet"/>
+      </w:pPr>
+      <w:r>
+        <w:t>Status values (proposed): Evaluation Pending → Draft → Pending Approval – Level n → Returned → Forwarded to HR → Completed, plus Cancelled.</w:t>
+      </w:r>
+    </w:p>
+    <w:p>
+      <w:pPr>
+        <w:pStyle w:val="ListBullet"/>
+      </w:pPr>
+      <w:r>
+        <w:t>History records the old status, new status, action, comments, user and date-time.</w:t>
+      </w:r>
+    </w:p>
+    <w:p>
+      <w:pPr>
+        <w:pStyle w:val="ListBullet"/>
+      </w:pPr>
+      <w:r>
+        <w:t xml:space="preserve">HR has a </w:t>
+      </w:r>
+      <w:r>
+        <w:rPr>
+          <w:b/>
+        </w:rPr>
+        <w:t>monitoring screen</w:t>
+      </w:r>
+      <w:r>
+        <w:t xml:space="preserve"> of all evaluations, with filters by status, department, evaluator and end date. It flags evaluations as </w:t>
+      </w:r>
+      <w:r>
+        <w:rPr>
+          <w:b/>
+        </w:rPr>
+        <w:t>overdue</w:t>
+      </w:r>
+      <w:r>
+        <w:t xml:space="preserve"> when they are not with HR by the probation end date.</w:t>
+      </w:r>
+    </w:p>
+    <w:p>
+      <w:pPr>
+        <w:pStyle w:val="ListBullet"/>
+      </w:pPr>
+      <w:r>
+        <w:t>Supervisors and approvers see the status of their own items.</w:t>
+      </w:r>
+    </w:p>
+    <w:p>
+      <w:pPr/>
+      <w:r>
+        <w:rPr>
+          <w:b/>
+        </w:rPr>
+        <w:t>Acceptance (summary):</w:t>
+      </w:r>
+    </w:p>
+    <w:p>
+      <w:pPr>
+        <w:pStyle w:val="ListBullet"/>
+      </w:pPr>
+      <w:r>
+        <w:t>Submitting a Draft changes the status to Pending Approval – Level 1 with no manual step.</w:t>
+      </w:r>
+    </w:p>
+    <w:p>
+      <w:pPr>
+        <w:pStyle w:val="ListBullet"/>
+      </w:pPr>
+      <w:r>
+        <w:t>The history shows each step in time order.</w:t>
+      </w:r>
+    </w:p>
+    <w:p>
+      <w:pPr>
+        <w:pStyle w:val="ListBullet"/>
+      </w:pPr>
+      <w:r>
+        <w:t>No user can edit or delete history.</w:t>
+      </w:r>
+    </w:p>
+    <w:p>
+      <w:pPr/>
+      <w:r>
+        <w:rPr>
+          <w:i/>
+        </w:rPr>
+        <w:t>Traceability: FR-017 – FR-020, RULE-08, RULE-10, NFR-AUD-01/02.</w:t>
+      </w:r>
+    </w:p>
+    <w:p>
+      <w:pPr>
+        <w:pStyle w:val="Heading3"/>
+      </w:pPr>
+      <w:r>
+        <w:t>3.5.1 Prototype (GUI): Monitoring and status history</w:t>
+      </w:r>
+    </w:p>
+    <w:p>
+      <w:pPr/>
+      <w:r>
+        <w:rPr>
+          <w:b/>
+        </w:rPr>
+        <w:t>Screen 8 – Probation Evaluation Monitoring and status history (HR)</w:t>
+      </w:r>
+    </w:p>
+    <w:p>
+      <w:pPr/>
+      <w:r>
+        <w:drawing>
+          <wp:inline xmlns:a="http://schemas.openxmlformats.org/drawingml/2006/main" xmlns:pic="http://schemas.openxmlformats.org/drawingml/2006/picture">
+            <wp:extent cx="5486400" cy="2580147"/>
+            <wp:docPr id="9" name="Picture 9"/>
+            <wp:cNvGraphicFramePr>
+              <a:graphicFrameLocks noChangeAspect="1"/>
+            </wp:cNvGraphicFramePr>
+            <a:graphic>
+              <a:graphicData uri="http://schemas.openxmlformats.org/drawingml/2006/picture">
+                <pic:pic>
+                  <pic:nvPicPr>
+                    <pic:cNvPr id="0" name="08_monitoring.png"/>
+                    <pic:cNvPicPr/>
+                  </pic:nvPicPr>
+                  <pic:blipFill>
+                    <a:blip r:embed="rId21"/>
+                    <a:stretch>
+                      <a:fillRect/>
+                    </a:stretch>
+                  </pic:blipFill>
+                  <pic:spPr>
+                    <a:xfrm>
+                      <a:off x="0" y="0"/>
+                      <a:ext cx="5486400" cy="2580147"/>
                     </a:xfrm>
                     <a:prstGeom prst="rect"/>
                   </pic:spPr>

</xml_diff>